<commit_message>
app updating. commit with bugs
</commit_message>
<xml_diff>
--- a/data/templates/calculation_claim.docx
+++ b/data/templates/calculation_claim.docx
@@ -132,8 +132,8 @@
         <w:gridCol w:w="194"/>
         <w:gridCol w:w="1578"/>
         <w:gridCol w:w="2050"/>
-        <w:gridCol w:w="1405"/>
-        <w:gridCol w:w="1794"/>
+        <w:gridCol w:w="1407"/>
+        <w:gridCol w:w="1792"/>
       </w:tblGrid>
       <w:tr>
         <w:trPr>
@@ -522,7 +522,7 @@
         </w:tc>
         <w:tc>
           <w:tcPr>
-            <w:tcW w:w="3455" w:type="dxa"/>
+            <w:tcW w:w="3457" w:type="dxa"/>
             <w:gridSpan w:val="2"/>
             <w:vMerge w:val="restart"/>
             <w:tcBorders>
@@ -557,7 +557,7 @@
         </w:tc>
         <w:tc>
           <w:tcPr>
-            <w:tcW w:w="1794" w:type="dxa"/>
+            <w:tcW w:w="1792" w:type="dxa"/>
             <w:vMerge w:val="restart"/>
             <w:tcBorders>
               <w:top w:val="single" w:sz="6" w:space="0" w:color="CCCCCC"/>
@@ -813,7 +813,7 @@
         </w:tc>
         <w:tc>
           <w:tcPr>
-            <w:tcW w:w="3455" w:type="dxa"/>
+            <w:tcW w:w="3457" w:type="dxa"/>
             <w:gridSpan w:val="2"/>
             <w:vMerge w:val="continue"/>
             <w:tcBorders>
@@ -843,7 +843,7 @@
         </w:tc>
         <w:tc>
           <w:tcPr>
-            <w:tcW w:w="1794" w:type="dxa"/>
+            <w:tcW w:w="1792" w:type="dxa"/>
             <w:vMerge w:val="continue"/>
             <w:tcBorders>
               <w:top w:val="single" w:sz="6" w:space="0" w:color="CCCCCC"/>
@@ -1309,7 +1309,7 @@
         </w:tc>
         <w:tc>
           <w:tcPr>
-            <w:tcW w:w="3455" w:type="dxa"/>
+            <w:tcW w:w="3457" w:type="dxa"/>
             <w:gridSpan w:val="2"/>
             <w:tcBorders>
               <w:top w:val="single" w:sz="6" w:space="0" w:color="CCCCCC"/>
@@ -1339,7 +1339,7 @@
         </w:tc>
         <w:tc>
           <w:tcPr>
-            <w:tcW w:w="1794" w:type="dxa"/>
+            <w:tcW w:w="1792" w:type="dxa"/>
             <w:tcBorders>
               <w:top w:val="single" w:sz="6" w:space="0" w:color="CCCCCC"/>
               <w:left w:val="single" w:sz="6" w:space="0" w:color="CCCCCC"/>
@@ -1758,7 +1758,7 @@
         </w:tc>
         <w:tc>
           <w:tcPr>
-            <w:tcW w:w="3455" w:type="dxa"/>
+            <w:tcW w:w="3457" w:type="dxa"/>
             <w:gridSpan w:val="2"/>
             <w:tcBorders>
               <w:top w:val="single" w:sz="6" w:space="0" w:color="CCCCCC"/>
@@ -1792,7 +1792,7 @@
         </w:tc>
         <w:tc>
           <w:tcPr>
-            <w:tcW w:w="1794" w:type="dxa"/>
+            <w:tcW w:w="1792" w:type="dxa"/>
             <w:tcBorders>
               <w:top w:val="single" w:sz="6" w:space="0" w:color="CCCCCC"/>
               <w:left w:val="single" w:sz="6" w:space="0" w:color="CCCCCC"/>
@@ -2430,13 +2430,17 @@
             <w:pPr>
               <w:pStyle w:val="Normal"/>
               <w:spacing w:lineRule="auto" w:line="240" w:before="0" w:after="0"/>
-              <w:rPr/>
-            </w:pPr>
-            <w:r>
-              <w:rPr>
-                <w:rFonts w:ascii="Times New Roman" w:hAnsi="Times New Roman"/>
-                <w:b/>
-                <w:bCs/>
+              <w:jc w:val="center"/>
+              <w:rPr>
+                <w:b w:val="false"/>
+                <w:bCs w:val="false"/>
+              </w:rPr>
+            </w:pPr>
+            <w:r>
+              <w:rPr>
+                <w:rFonts w:ascii="Times New Roman" w:hAnsi="Times New Roman"/>
+                <w:b w:val="false"/>
+                <w:bCs w:val="false"/>
                 <w:sz w:val="18"/>
                 <w:szCs w:val="18"/>
                 <w:shd w:fill="auto" w:val="clear"/>
@@ -2462,13 +2466,17 @@
             <w:pPr>
               <w:pStyle w:val="Normal"/>
               <w:spacing w:lineRule="auto" w:line="240" w:before="0" w:after="0"/>
-              <w:rPr/>
-            </w:pPr>
-            <w:r>
-              <w:rPr>
-                <w:rFonts w:ascii="Times New Roman" w:hAnsi="Times New Roman"/>
-                <w:b/>
-                <w:bCs/>
+              <w:jc w:val="center"/>
+              <w:rPr>
+                <w:b w:val="false"/>
+                <w:bCs w:val="false"/>
+              </w:rPr>
+            </w:pPr>
+            <w:r>
+              <w:rPr>
+                <w:rFonts w:ascii="Times New Roman" w:hAnsi="Times New Roman"/>
+                <w:b w:val="false"/>
+                <w:bCs w:val="false"/>
                 <w:sz w:val="18"/>
                 <w:szCs w:val="18"/>
                 <w:shd w:fill="auto" w:val="clear"/>
@@ -2479,8 +2487,8 @@
             <w:r>
               <w:rPr>
                 <w:rFonts w:ascii="Times New Roman" w:hAnsi="Times New Roman"/>
-                <w:b/>
-                <w:bCs/>
+                <w:b w:val="false"/>
+                <w:bCs w:val="false"/>
                 <w:sz w:val="18"/>
                 <w:szCs w:val="18"/>
                 <w:shd w:fill="auto" w:val="clear"/>
@@ -2506,13 +2514,17 @@
             <w:pPr>
               <w:pStyle w:val="Normal"/>
               <w:spacing w:lineRule="auto" w:line="240" w:before="0" w:after="0"/>
-              <w:rPr/>
-            </w:pPr>
-            <w:r>
-              <w:rPr>
-                <w:rFonts w:ascii="Times New Roman" w:hAnsi="Times New Roman"/>
-                <w:b/>
-                <w:bCs/>
+              <w:jc w:val="center"/>
+              <w:rPr>
+                <w:b w:val="false"/>
+                <w:bCs w:val="false"/>
+              </w:rPr>
+            </w:pPr>
+            <w:r>
+              <w:rPr>
+                <w:rFonts w:ascii="Times New Roman" w:hAnsi="Times New Roman"/>
+                <w:b w:val="false"/>
+                <w:bCs w:val="false"/>
                 <w:sz w:val="18"/>
                 <w:szCs w:val="18"/>
                 <w:shd w:fill="auto" w:val="clear"/>
@@ -2523,8 +2535,8 @@
             <w:r>
               <w:rPr>
                 <w:rFonts w:ascii="Times New Roman" w:hAnsi="Times New Roman"/>
-                <w:b/>
-                <w:bCs/>
+                <w:b w:val="false"/>
+                <w:bCs w:val="false"/>
                 <w:sz w:val="18"/>
                 <w:szCs w:val="18"/>
                 <w:shd w:fill="auto" w:val="clear"/>
@@ -2550,13 +2562,17 @@
             <w:pPr>
               <w:pStyle w:val="Normal"/>
               <w:spacing w:lineRule="auto" w:line="240" w:before="0" w:after="0"/>
-              <w:rPr/>
-            </w:pPr>
-            <w:r>
-              <w:rPr>
-                <w:rFonts w:ascii="Times New Roman" w:hAnsi="Times New Roman"/>
-                <w:b/>
-                <w:bCs/>
+              <w:jc w:val="center"/>
+              <w:rPr>
+                <w:b w:val="false"/>
+                <w:bCs w:val="false"/>
+              </w:rPr>
+            </w:pPr>
+            <w:r>
+              <w:rPr>
+                <w:rFonts w:ascii="Times New Roman" w:hAnsi="Times New Roman"/>
+                <w:b w:val="false"/>
+                <w:bCs w:val="false"/>
                 <w:sz w:val="18"/>
                 <w:szCs w:val="18"/>
                 <w:shd w:fill="auto" w:val="clear"/>
@@ -2567,8 +2583,8 @@
             <w:r>
               <w:rPr>
                 <w:rFonts w:ascii="Times New Roman" w:hAnsi="Times New Roman"/>
-                <w:b/>
-                <w:bCs/>
+                <w:b w:val="false"/>
+                <w:bCs w:val="false"/>
                 <w:sz w:val="18"/>
                 <w:szCs w:val="18"/>
                 <w:shd w:fill="auto" w:val="clear"/>
@@ -2818,29 +2834,7 @@
           <w:szCs w:val="24"/>
           <w:lang w:val="ru-RU"/>
         </w:rPr>
-        <w:t xml:space="preserve">Общая цена иска: </w:t>
-      </w:r>
-      <w:r>
-        <w:rPr>
-          <w:rFonts w:ascii="Times New Roman" w:hAnsi="Times New Roman"/>
-          <w:b/>
-          <w:bCs/>
-          <w:sz w:val="24"/>
-          <w:szCs w:val="24"/>
-          <w:lang w:val="ru-RU"/>
-        </w:rPr>
-        <w:t>/*цена иска*/</w:t>
-      </w:r>
-      <w:r>
-        <w:rPr>
-          <w:rFonts w:ascii="Times New Roman" w:hAnsi="Times New Roman"/>
-          <w:b/>
-          <w:bCs/>
-          <w:sz w:val="24"/>
-          <w:szCs w:val="24"/>
-          <w:lang w:val="ru-RU"/>
-        </w:rPr>
-        <w:t xml:space="preserve"> </w:t>
+        <w:t xml:space="preserve">Общая цена иска: /*цена иска*/ </w:t>
       </w:r>
       <w:bookmarkStart w:id="0" w:name="_Hlk99377779"/>
       <w:r>
@@ -2913,18 +2907,7 @@
           <w:szCs w:val="24"/>
           <w:lang w:val="ru-RU"/>
         </w:rPr>
-        <w:t xml:space="preserve">/*госпошлина*/ </w:t>
-      </w:r>
-      <w:r>
-        <w:rPr>
-          <w:rFonts w:ascii="Times New Roman" w:hAnsi="Times New Roman"/>
-          <w:b/>
-          <w:bCs/>
-          <w:sz w:val="24"/>
-          <w:szCs w:val="24"/>
-          <w:lang w:val="ru-RU"/>
-        </w:rPr>
-        <w:t>рублей.</w:t>
+        <w:t>/*госпошлина*/ рублей.</w:t>
       </w:r>
     </w:p>
     <w:p>

</xml_diff>

<commit_message>
fix bug with forms and templates
</commit_message>
<xml_diff>
--- a/data/templates/calculation_claim.docx
+++ b/data/templates/calculation_claim.docx
@@ -105,7 +105,7 @@
           <w:szCs w:val="24"/>
           <w:lang w:val="ru-RU"/>
         </w:rPr>
-        <w:t>Исходя из размера Основного долга и Периода задолженности, неустойка по состоянию на 25.04.2025 составляет:</w:t>
+        <w:t>Исходя из размера Основного долга и Периода задолженности, неустойка по состоянию на /*текущая дата*/ составляет:</w:t>
       </w:r>
     </w:p>
     <w:tbl>
@@ -132,8 +132,8 @@
         <w:gridCol w:w="194"/>
         <w:gridCol w:w="1578"/>
         <w:gridCol w:w="2050"/>
-        <w:gridCol w:w="1407"/>
-        <w:gridCol w:w="1792"/>
+        <w:gridCol w:w="1415"/>
+        <w:gridCol w:w="1784"/>
       </w:tblGrid>
       <w:tr>
         <w:trPr>
@@ -197,7 +197,7 @@
                 <w:shd w:fill="auto" w:val="clear"/>
                 <w:lang w:val="ru-RU"/>
               </w:rPr>
-              <w:t xml:space="preserve">Договор № </w:t>
+              <w:t xml:space="preserve">Договор </w:t>
             </w:r>
             <w:r>
               <w:rPr>
@@ -522,7 +522,7 @@
         </w:tc>
         <w:tc>
           <w:tcPr>
-            <w:tcW w:w="3457" w:type="dxa"/>
+            <w:tcW w:w="3465" w:type="dxa"/>
             <w:gridSpan w:val="2"/>
             <w:vMerge w:val="restart"/>
             <w:tcBorders>
@@ -557,7 +557,7 @@
         </w:tc>
         <w:tc>
           <w:tcPr>
-            <w:tcW w:w="1792" w:type="dxa"/>
+            <w:tcW w:w="1784" w:type="dxa"/>
             <w:vMerge w:val="restart"/>
             <w:tcBorders>
               <w:top w:val="single" w:sz="6" w:space="0" w:color="CCCCCC"/>
@@ -813,7 +813,7 @@
         </w:tc>
         <w:tc>
           <w:tcPr>
-            <w:tcW w:w="3457" w:type="dxa"/>
+            <w:tcW w:w="3465" w:type="dxa"/>
             <w:gridSpan w:val="2"/>
             <w:vMerge w:val="continue"/>
             <w:tcBorders>
@@ -843,7 +843,7 @@
         </w:tc>
         <w:tc>
           <w:tcPr>
-            <w:tcW w:w="1792" w:type="dxa"/>
+            <w:tcW w:w="1784" w:type="dxa"/>
             <w:vMerge w:val="continue"/>
             <w:tcBorders>
               <w:top w:val="single" w:sz="6" w:space="0" w:color="CCCCCC"/>
@@ -1309,7 +1309,7 @@
         </w:tc>
         <w:tc>
           <w:tcPr>
-            <w:tcW w:w="3457" w:type="dxa"/>
+            <w:tcW w:w="3465" w:type="dxa"/>
             <w:gridSpan w:val="2"/>
             <w:tcBorders>
               <w:top w:val="single" w:sz="6" w:space="0" w:color="CCCCCC"/>
@@ -1339,7 +1339,7 @@
         </w:tc>
         <w:tc>
           <w:tcPr>
-            <w:tcW w:w="1792" w:type="dxa"/>
+            <w:tcW w:w="1784" w:type="dxa"/>
             <w:tcBorders>
               <w:top w:val="single" w:sz="6" w:space="0" w:color="CCCCCC"/>
               <w:left w:val="single" w:sz="6" w:space="0" w:color="CCCCCC"/>
@@ -1758,7 +1758,7 @@
         </w:tc>
         <w:tc>
           <w:tcPr>
-            <w:tcW w:w="3457" w:type="dxa"/>
+            <w:tcW w:w="3465" w:type="dxa"/>
             <w:gridSpan w:val="2"/>
             <w:tcBorders>
               <w:top w:val="single" w:sz="6" w:space="0" w:color="CCCCCC"/>
@@ -1792,7 +1792,7 @@
         </w:tc>
         <w:tc>
           <w:tcPr>
-            <w:tcW w:w="1792" w:type="dxa"/>
+            <w:tcW w:w="1784" w:type="dxa"/>
             <w:tcBorders>
               <w:top w:val="single" w:sz="6" w:space="0" w:color="CCCCCC"/>
               <w:left w:val="single" w:sz="6" w:space="0" w:color="CCCCCC"/>
@@ -2400,13 +2400,18 @@
               <w:pStyle w:val="Normal"/>
               <w:spacing w:lineRule="auto" w:line="240" w:before="0" w:after="0"/>
               <w:jc w:val="center"/>
-              <w:rPr/>
+              <w:rPr>
+                <w:sz w:val="22"/>
+                <w:szCs w:val="22"/>
+              </w:rPr>
             </w:pPr>
             <w:r>
               <w:rPr>
                 <w:rFonts w:ascii="Times New Roman" w:hAnsi="Times New Roman"/>
                 <w:b/>
                 <w:bCs/>
+                <w:sz w:val="22"/>
+                <w:szCs w:val="22"/>
                 <w:shd w:fill="auto" w:val="clear"/>
                 <w:lang w:val="ru-RU"/>
               </w:rPr>
@@ -2432,17 +2437,17 @@
               <w:spacing w:lineRule="auto" w:line="240" w:before="0" w:after="0"/>
               <w:jc w:val="center"/>
               <w:rPr>
+                <w:sz w:val="22"/>
+                <w:szCs w:val="22"/>
+              </w:rPr>
+            </w:pPr>
+            <w:r>
+              <w:rPr>
+                <w:rFonts w:ascii="Times New Roman" w:hAnsi="Times New Roman"/>
                 <w:b w:val="false"/>
                 <w:bCs w:val="false"/>
-              </w:rPr>
-            </w:pPr>
-            <w:r>
-              <w:rPr>
-                <w:rFonts w:ascii="Times New Roman" w:hAnsi="Times New Roman"/>
-                <w:b w:val="false"/>
-                <w:bCs w:val="false"/>
-                <w:sz w:val="18"/>
-                <w:szCs w:val="18"/>
+                <w:sz w:val="22"/>
+                <w:szCs w:val="22"/>
                 <w:shd w:fill="auto" w:val="clear"/>
                 <w:lang w:val="ru-RU"/>
               </w:rPr>
@@ -2468,29 +2473,29 @@
               <w:spacing w:lineRule="auto" w:line="240" w:before="0" w:after="0"/>
               <w:jc w:val="center"/>
               <w:rPr>
+                <w:sz w:val="22"/>
+                <w:szCs w:val="22"/>
+              </w:rPr>
+            </w:pPr>
+            <w:r>
+              <w:rPr>
+                <w:rFonts w:ascii="Times New Roman" w:hAnsi="Times New Roman"/>
                 <w:b w:val="false"/>
                 <w:bCs w:val="false"/>
-              </w:rPr>
-            </w:pPr>
+                <w:sz w:val="22"/>
+                <w:szCs w:val="22"/>
+                <w:shd w:fill="auto" w:val="clear"/>
+                <w:lang w:val="ru-RU"/>
+              </w:rPr>
+              <w:t xml:space="preserve"> </w:t>
+            </w:r>
             <w:r>
               <w:rPr>
                 <w:rFonts w:ascii="Times New Roman" w:hAnsi="Times New Roman"/>
                 <w:b w:val="false"/>
                 <w:bCs w:val="false"/>
-                <w:sz w:val="18"/>
-                <w:szCs w:val="18"/>
-                <w:shd w:fill="auto" w:val="clear"/>
-                <w:lang w:val="ru-RU"/>
-              </w:rPr>
-              <w:t xml:space="preserve"> </w:t>
-            </w:r>
-            <w:r>
-              <w:rPr>
-                <w:rFonts w:ascii="Times New Roman" w:hAnsi="Times New Roman"/>
-                <w:b w:val="false"/>
-                <w:bCs w:val="false"/>
-                <w:sz w:val="18"/>
-                <w:szCs w:val="18"/>
+                <w:sz w:val="22"/>
+                <w:szCs w:val="22"/>
                 <w:shd w:fill="auto" w:val="clear"/>
                 <w:lang w:val="ru-RU"/>
               </w:rPr>
@@ -2516,29 +2521,29 @@
               <w:spacing w:lineRule="auto" w:line="240" w:before="0" w:after="0"/>
               <w:jc w:val="center"/>
               <w:rPr>
+                <w:sz w:val="22"/>
+                <w:szCs w:val="22"/>
+              </w:rPr>
+            </w:pPr>
+            <w:r>
+              <w:rPr>
+                <w:rFonts w:ascii="Times New Roman" w:hAnsi="Times New Roman"/>
                 <w:b w:val="false"/>
                 <w:bCs w:val="false"/>
-              </w:rPr>
-            </w:pPr>
+                <w:sz w:val="22"/>
+                <w:szCs w:val="22"/>
+                <w:shd w:fill="auto" w:val="clear"/>
+                <w:lang w:val="ru-RU"/>
+              </w:rPr>
+              <w:t xml:space="preserve"> </w:t>
+            </w:r>
             <w:r>
               <w:rPr>
                 <w:rFonts w:ascii="Times New Roman" w:hAnsi="Times New Roman"/>
                 <w:b w:val="false"/>
                 <w:bCs w:val="false"/>
-                <w:sz w:val="18"/>
-                <w:szCs w:val="18"/>
-                <w:shd w:fill="auto" w:val="clear"/>
-                <w:lang w:val="ru-RU"/>
-              </w:rPr>
-              <w:t xml:space="preserve"> </w:t>
-            </w:r>
-            <w:r>
-              <w:rPr>
-                <w:rFonts w:ascii="Times New Roman" w:hAnsi="Times New Roman"/>
-                <w:b w:val="false"/>
-                <w:bCs w:val="false"/>
-                <w:sz w:val="18"/>
-                <w:szCs w:val="18"/>
+                <w:sz w:val="22"/>
+                <w:szCs w:val="22"/>
                 <w:shd w:fill="auto" w:val="clear"/>
                 <w:lang w:val="ru-RU"/>
               </w:rPr>
@@ -2564,29 +2569,29 @@
               <w:spacing w:lineRule="auto" w:line="240" w:before="0" w:after="0"/>
               <w:jc w:val="center"/>
               <w:rPr>
+                <w:sz w:val="22"/>
+                <w:szCs w:val="22"/>
+              </w:rPr>
+            </w:pPr>
+            <w:r>
+              <w:rPr>
+                <w:rFonts w:ascii="Times New Roman" w:hAnsi="Times New Roman"/>
                 <w:b w:val="false"/>
                 <w:bCs w:val="false"/>
-              </w:rPr>
-            </w:pPr>
+                <w:sz w:val="22"/>
+                <w:szCs w:val="22"/>
+                <w:shd w:fill="auto" w:val="clear"/>
+                <w:lang w:val="ru-RU"/>
+              </w:rPr>
+              <w:t xml:space="preserve"> </w:t>
+            </w:r>
             <w:r>
               <w:rPr>
                 <w:rFonts w:ascii="Times New Roman" w:hAnsi="Times New Roman"/>
                 <w:b w:val="false"/>
                 <w:bCs w:val="false"/>
-                <w:sz w:val="18"/>
-                <w:szCs w:val="18"/>
-                <w:shd w:fill="auto" w:val="clear"/>
-                <w:lang w:val="ru-RU"/>
-              </w:rPr>
-              <w:t xml:space="preserve"> </w:t>
-            </w:r>
-            <w:r>
-              <w:rPr>
-                <w:rFonts w:ascii="Times New Roman" w:hAnsi="Times New Roman"/>
-                <w:b w:val="false"/>
-                <w:bCs w:val="false"/>
-                <w:sz w:val="18"/>
-                <w:szCs w:val="18"/>
+                <w:sz w:val="22"/>
+                <w:szCs w:val="22"/>
                 <w:shd w:fill="auto" w:val="clear"/>
                 <w:lang w:val="ru-RU"/>
               </w:rPr>
@@ -2617,13 +2622,18 @@
               <w:pStyle w:val="Normal"/>
               <w:spacing w:lineRule="auto" w:line="240" w:before="0" w:after="0"/>
               <w:jc w:val="right"/>
-              <w:rPr/>
+              <w:rPr>
+                <w:sz w:val="22"/>
+                <w:szCs w:val="22"/>
+              </w:rPr>
             </w:pPr>
             <w:r>
               <w:rPr>
                 <w:rFonts w:ascii="Times New Roman" w:hAnsi="Times New Roman"/>
                 <w:b/>
                 <w:bCs/>
+                <w:sz w:val="22"/>
+                <w:szCs w:val="22"/>
                 <w:shd w:fill="auto" w:val="clear"/>
                 <w:lang w:val="ru-RU"/>
               </w:rPr>
@@ -2647,15 +2657,18 @@
             <w:pPr>
               <w:pStyle w:val="Normal"/>
               <w:spacing w:lineRule="auto" w:line="240" w:before="0" w:after="0"/>
-              <w:rPr/>
+              <w:rPr>
+                <w:sz w:val="22"/>
+                <w:szCs w:val="22"/>
+              </w:rPr>
             </w:pPr>
             <w:r>
               <w:rPr>
                 <w:rFonts w:ascii="Times New Roman" w:hAnsi="Times New Roman"/>
                 <w:b/>
                 <w:bCs/>
-                <w:sz w:val="18"/>
-                <w:szCs w:val="18"/>
+                <w:sz w:val="22"/>
+                <w:szCs w:val="22"/>
                 <w:shd w:fill="auto" w:val="clear"/>
                 <w:lang w:val="ru-RU"/>
               </w:rPr>
@@ -2666,8 +2679,8 @@
                 <w:rFonts w:ascii="Times New Roman" w:hAnsi="Times New Roman"/>
                 <w:b/>
                 <w:bCs/>
-                <w:sz w:val="18"/>
-                <w:szCs w:val="18"/>
+                <w:sz w:val="22"/>
+                <w:szCs w:val="22"/>
                 <w:shd w:fill="auto" w:val="clear"/>
                 <w:lang w:val="ru-RU"/>
               </w:rPr>
@@ -2691,15 +2704,18 @@
             <w:pPr>
               <w:pStyle w:val="Normal"/>
               <w:spacing w:lineRule="auto" w:line="240" w:before="0" w:after="0"/>
-              <w:rPr/>
+              <w:rPr>
+                <w:sz w:val="22"/>
+                <w:szCs w:val="22"/>
+              </w:rPr>
             </w:pPr>
             <w:r>
               <w:rPr>
                 <w:rFonts w:ascii="Times New Roman" w:hAnsi="Times New Roman"/>
                 <w:b/>
                 <w:bCs/>
-                <w:sz w:val="18"/>
-                <w:szCs w:val="18"/>
+                <w:sz w:val="22"/>
+                <w:szCs w:val="22"/>
                 <w:shd w:fill="auto" w:val="clear"/>
                 <w:lang w:val="ru-RU"/>
               </w:rPr>
@@ -2710,8 +2726,8 @@
                 <w:rFonts w:ascii="Times New Roman" w:hAnsi="Times New Roman"/>
                 <w:b/>
                 <w:bCs/>
-                <w:sz w:val="18"/>
-                <w:szCs w:val="18"/>
+                <w:sz w:val="22"/>
+                <w:szCs w:val="22"/>
                 <w:shd w:fill="auto" w:val="clear"/>
                 <w:lang w:val="ru-RU"/>
               </w:rPr>
@@ -2735,15 +2751,18 @@
             <w:pPr>
               <w:pStyle w:val="Normal"/>
               <w:spacing w:lineRule="auto" w:line="240" w:before="0" w:after="0"/>
-              <w:rPr/>
+              <w:rPr>
+                <w:sz w:val="22"/>
+                <w:szCs w:val="22"/>
+              </w:rPr>
             </w:pPr>
             <w:r>
               <w:rPr>
                 <w:rFonts w:ascii="Times New Roman" w:hAnsi="Times New Roman"/>
                 <w:b/>
                 <w:bCs/>
-                <w:sz w:val="18"/>
-                <w:szCs w:val="18"/>
+                <w:sz w:val="22"/>
+                <w:szCs w:val="22"/>
                 <w:shd w:fill="auto" w:val="clear"/>
                 <w:lang w:val="ru-RU"/>
               </w:rPr>
@@ -2754,8 +2773,8 @@
                 <w:rFonts w:ascii="Times New Roman" w:hAnsi="Times New Roman"/>
                 <w:b/>
                 <w:bCs/>
-                <w:sz w:val="18"/>
-                <w:szCs w:val="18"/>
+                <w:sz w:val="22"/>
+                <w:szCs w:val="22"/>
                 <w:shd w:fill="auto" w:val="clear"/>
                 <w:lang w:val="ru-RU"/>
               </w:rPr>

</xml_diff>

<commit_message>
Solve the problem with merging of claim.docx template
</commit_message>
<xml_diff>
--- a/data/templates/calculation_claim.docx
+++ b/data/templates/calculation_claim.docx
@@ -116,9 +116,9 @@
     </w:p>
     <w:tbl>
       <w:tblPr>
-        <w:tblW w:w="5000" w:type="pct"/>
+        <w:tblW w:w="14570" w:type="dxa"/>
         <w:jc w:val="left"/>
-        <w:tblInd w:w="0" w:type="dxa"/>
+        <w:tblInd w:w="60" w:type="dxa"/>
         <w:tblLayout w:type="fixed"/>
         <w:tblCellMar>
           <w:top w:w="30" w:type="dxa"/>
@@ -129,18 +129,17 @@
         <w:tblLook w:val="04a0" w:noHBand="0" w:noVBand="1" w:firstColumn="1" w:lastRow="0" w:lastColumn="0" w:firstRow="1"/>
       </w:tblPr>
       <w:tblGrid>
-        <w:gridCol w:w="1809"/>
-        <w:gridCol w:w="1356"/>
-        <w:gridCol w:w="108"/>
-        <w:gridCol w:w="1252"/>
-        <w:gridCol w:w="1356"/>
-        <w:gridCol w:w="730"/>
-        <w:gridCol w:w="915"/>
-        <w:gridCol w:w="137"/>
-        <w:gridCol w:w="1667"/>
-        <w:gridCol w:w="2337"/>
-        <w:gridCol w:w="1101"/>
-        <w:gridCol w:w="1800"/>
+        <w:gridCol w:w="1701"/>
+        <w:gridCol w:w="1360"/>
+        <w:gridCol w:w="1"/>
+        <w:gridCol w:w="1473"/>
+        <w:gridCol w:w="1475"/>
+        <w:gridCol w:w="878"/>
+        <w:gridCol w:w="908"/>
+        <w:gridCol w:w="1589"/>
+        <w:gridCol w:w="1983"/>
+        <w:gridCol w:w="1404"/>
+        <w:gridCol w:w="1796"/>
       </w:tblGrid>
       <w:tr>
         <w:trPr>
@@ -148,8 +147,8 @@
         </w:trPr>
         <w:tc>
           <w:tcPr>
-            <w:tcW w:w="3273" w:type="dxa"/>
-            <w:gridSpan w:val="3"/>
+            <w:tcW w:w="3061" w:type="dxa"/>
+            <w:gridSpan w:val="2"/>
             <w:tcBorders>
               <w:top w:val="single" w:sz="6" w:space="0" w:color="CCCCCC"/>
               <w:left w:val="single" w:sz="6" w:space="0" w:color="CCCCCC"/>
@@ -182,7 +181,7 @@
         </w:tc>
         <w:tc>
           <w:tcPr>
-            <w:tcW w:w="11295" w:type="dxa"/>
+            <w:tcW w:w="11507" w:type="dxa"/>
             <w:gridSpan w:val="9"/>
             <w:tcBorders>
               <w:top w:val="single" w:sz="6" w:space="0" w:color="CCCCCC"/>
@@ -224,8 +223,8 @@
         </w:trPr>
         <w:tc>
           <w:tcPr>
-            <w:tcW w:w="3273" w:type="dxa"/>
-            <w:gridSpan w:val="3"/>
+            <w:tcW w:w="3061" w:type="dxa"/>
+            <w:gridSpan w:val="2"/>
             <w:tcBorders>
               <w:top w:val="single" w:sz="6" w:space="0" w:color="CCCCCC"/>
               <w:left w:val="single" w:sz="6" w:space="0" w:color="CCCCCC"/>
@@ -258,8 +257,8 @@
         </w:tc>
         <w:tc>
           <w:tcPr>
-            <w:tcW w:w="4253" w:type="dxa"/>
-            <w:gridSpan w:val="4"/>
+            <w:tcW w:w="4735" w:type="dxa"/>
+            <w:gridSpan w:val="5"/>
             <w:tcBorders>
               <w:top w:val="single" w:sz="6" w:space="0" w:color="CCCCCC"/>
               <w:left w:val="single" w:sz="6" w:space="0" w:color="CCCCCC"/>
@@ -292,8 +291,8 @@
         </w:tc>
         <w:tc>
           <w:tcPr>
-            <w:tcW w:w="4141" w:type="dxa"/>
-            <w:gridSpan w:val="3"/>
+            <w:tcW w:w="3572" w:type="dxa"/>
+            <w:gridSpan w:val="2"/>
             <w:tcBorders>
               <w:top w:val="single" w:sz="6" w:space="0" w:color="CCCCCC"/>
               <w:left w:val="single" w:sz="6" w:space="0" w:color="CCCCCC"/>
@@ -326,7 +325,7 @@
         </w:tc>
         <w:tc>
           <w:tcPr>
-            <w:tcW w:w="2901" w:type="dxa"/>
+            <w:tcW w:w="3200" w:type="dxa"/>
             <w:gridSpan w:val="2"/>
             <w:tcBorders>
               <w:top w:val="single" w:sz="6" w:space="0" w:color="CCCCCC"/>
@@ -361,7 +360,7 @@
         <w:trPr/>
         <w:tc>
           <w:tcPr>
-            <w:tcW w:w="1809" w:type="dxa"/>
+            <w:tcW w:w="1701" w:type="dxa"/>
             <w:vMerge w:val="restart"/>
             <w:tcBorders>
               <w:top w:val="single" w:sz="6" w:space="0" w:color="CCCCCC"/>
@@ -400,7 +399,7 @@
         </w:tc>
         <w:tc>
           <w:tcPr>
-            <w:tcW w:w="1356" w:type="dxa"/>
+            <w:tcW w:w="1360" w:type="dxa"/>
             <w:vMerge w:val="restart"/>
             <w:tcBorders>
               <w:top w:val="single" w:sz="6" w:space="0" w:color="CCCCCC"/>
@@ -439,7 +438,7 @@
         </w:tc>
         <w:tc>
           <w:tcPr>
-            <w:tcW w:w="3446" w:type="dxa"/>
+            <w:tcW w:w="3827" w:type="dxa"/>
             <w:gridSpan w:val="4"/>
             <w:tcBorders>
               <w:top w:val="single" w:sz="6" w:space="0" w:color="CCCCCC"/>
@@ -478,7 +477,85 @@
         </w:tc>
         <w:tc>
           <w:tcPr>
-            <w:tcW w:w="1052" w:type="dxa"/>
+            <w:tcW w:w="908" w:type="dxa"/>
+            <w:vMerge w:val="restart"/>
+            <w:tcBorders>
+              <w:top w:val="single" w:sz="6" w:space="0" w:color="CCCCCC"/>
+              <w:left w:val="single" w:sz="6" w:space="0" w:color="CCCCCC"/>
+              <w:bottom w:val="single" w:sz="6" w:space="0" w:color="CCCCCC"/>
+              <w:right w:val="single" w:sz="6" w:space="0" w:color="CCCCCC"/>
+            </w:tcBorders>
+            <w:vAlign w:val="center"/>
+          </w:tcPr>
+          <w:p>
+            <w:pPr>
+              <w:pStyle w:val="Normal"/>
+              <w:spacing w:lineRule="auto" w:line="240" w:before="0" w:after="0"/>
+              <w:jc w:val="center"/>
+              <w:rPr>
+                <w:rFonts w:ascii="Times New Roman" w:hAnsi="Times New Roman" w:eastAsia="Times New Roman" w:cs="Times New Roman"/>
+                <w:b/>
+                <w:bCs/>
+                <w:sz w:val="18"/>
+                <w:szCs w:val="18"/>
+                <w:lang w:eastAsia="ru-RU"/>
+              </w:rPr>
+            </w:pPr>
+            <w:r>
+              <w:rPr>
+                <w:rFonts w:eastAsia="Times New Roman" w:cs="Times New Roman" w:ascii="Times New Roman" w:hAnsi="Times New Roman"/>
+                <w:b/>
+                <w:bCs/>
+                <w:sz w:val="18"/>
+                <w:szCs w:val="18"/>
+                <w:lang w:eastAsia="ru-RU"/>
+              </w:rPr>
+              <w:t>Ставка</w:t>
+            </w:r>
+          </w:p>
+        </w:tc>
+        <w:tc>
+          <w:tcPr>
+            <w:tcW w:w="1589" w:type="dxa"/>
+            <w:vMerge w:val="restart"/>
+            <w:tcBorders>
+              <w:top w:val="single" w:sz="6" w:space="0" w:color="CCCCCC"/>
+              <w:left w:val="single" w:sz="6" w:space="0" w:color="CCCCCC"/>
+              <w:bottom w:val="single" w:sz="6" w:space="0" w:color="CCCCCC"/>
+              <w:right w:val="single" w:sz="6" w:space="0" w:color="CCCCCC"/>
+            </w:tcBorders>
+            <w:vAlign w:val="center"/>
+          </w:tcPr>
+          <w:p>
+            <w:pPr>
+              <w:pStyle w:val="Normal"/>
+              <w:spacing w:lineRule="auto" w:line="240" w:before="0" w:after="0"/>
+              <w:jc w:val="center"/>
+              <w:rPr>
+                <w:rFonts w:ascii="Times New Roman" w:hAnsi="Times New Roman" w:eastAsia="Times New Roman" w:cs="Times New Roman"/>
+                <w:b/>
+                <w:bCs/>
+                <w:sz w:val="18"/>
+                <w:szCs w:val="18"/>
+                <w:lang w:eastAsia="ru-RU"/>
+              </w:rPr>
+            </w:pPr>
+            <w:r>
+              <w:rPr>
+                <w:rFonts w:eastAsia="Times New Roman" w:cs="Times New Roman" w:ascii="Times New Roman" w:hAnsi="Times New Roman"/>
+                <w:b/>
+                <w:bCs/>
+                <w:sz w:val="18"/>
+                <w:szCs w:val="18"/>
+                <w:lang w:eastAsia="ru-RU"/>
+              </w:rPr>
+              <w:t>Доля ставки</w:t>
+            </w:r>
+          </w:p>
+        </w:tc>
+        <w:tc>
+          <w:tcPr>
+            <w:tcW w:w="3387" w:type="dxa"/>
             <w:gridSpan w:val="2"/>
             <w:vMerge w:val="restart"/>
             <w:tcBorders>
@@ -512,92 +589,13 @@
                 <w:szCs w:val="18"/>
                 <w:lang w:eastAsia="ru-RU"/>
               </w:rPr>
-              <w:t>Ставка</w:t>
-            </w:r>
-          </w:p>
-        </w:tc>
-        <w:tc>
-          <w:tcPr>
-            <w:tcW w:w="1667" w:type="dxa"/>
-            <w:vMerge w:val="restart"/>
-            <w:tcBorders>
-              <w:top w:val="single" w:sz="6" w:space="0" w:color="CCCCCC"/>
-              <w:left w:val="single" w:sz="6" w:space="0" w:color="CCCCCC"/>
-              <w:bottom w:val="single" w:sz="6" w:space="0" w:color="CCCCCC"/>
-              <w:right w:val="single" w:sz="6" w:space="0" w:color="CCCCCC"/>
-            </w:tcBorders>
-            <w:vAlign w:val="center"/>
-          </w:tcPr>
-          <w:p>
-            <w:pPr>
-              <w:pStyle w:val="Normal"/>
-              <w:spacing w:lineRule="auto" w:line="240" w:before="0" w:after="0"/>
-              <w:jc w:val="center"/>
-              <w:rPr>
-                <w:rFonts w:ascii="Times New Roman" w:hAnsi="Times New Roman" w:eastAsia="Times New Roman" w:cs="Times New Roman"/>
-                <w:b/>
-                <w:bCs/>
-                <w:sz w:val="18"/>
-                <w:szCs w:val="18"/>
-                <w:lang w:eastAsia="ru-RU"/>
-              </w:rPr>
-            </w:pPr>
-            <w:r>
-              <w:rPr>
-                <w:rFonts w:eastAsia="Times New Roman" w:cs="Times New Roman" w:ascii="Times New Roman" w:hAnsi="Times New Roman"/>
-                <w:b/>
-                <w:bCs/>
-                <w:sz w:val="18"/>
-                <w:szCs w:val="18"/>
-                <w:lang w:eastAsia="ru-RU"/>
-              </w:rPr>
-              <w:t>Доля ставки</w:t>
-            </w:r>
-          </w:p>
-        </w:tc>
-        <w:tc>
-          <w:tcPr>
-            <w:tcW w:w="3438" w:type="dxa"/>
-            <w:gridSpan w:val="2"/>
-            <w:vMerge w:val="restart"/>
-            <w:tcBorders>
-              <w:top w:val="single" w:sz="6" w:space="0" w:color="CCCCCC"/>
-              <w:left w:val="single" w:sz="6" w:space="0" w:color="CCCCCC"/>
-              <w:bottom w:val="single" w:sz="6" w:space="0" w:color="CCCCCC"/>
-              <w:right w:val="single" w:sz="6" w:space="0" w:color="CCCCCC"/>
-            </w:tcBorders>
-            <w:vAlign w:val="center"/>
-          </w:tcPr>
-          <w:p>
-            <w:pPr>
-              <w:pStyle w:val="Normal"/>
-              <w:spacing w:lineRule="auto" w:line="240" w:before="0" w:after="0"/>
-              <w:jc w:val="center"/>
-              <w:rPr>
-                <w:rFonts w:ascii="Times New Roman" w:hAnsi="Times New Roman" w:eastAsia="Times New Roman" w:cs="Times New Roman"/>
-                <w:b/>
-                <w:bCs/>
-                <w:sz w:val="18"/>
-                <w:szCs w:val="18"/>
-                <w:lang w:eastAsia="ru-RU"/>
-              </w:rPr>
-            </w:pPr>
-            <w:r>
-              <w:rPr>
-                <w:rFonts w:eastAsia="Times New Roman" w:cs="Times New Roman" w:ascii="Times New Roman" w:hAnsi="Times New Roman"/>
-                <w:b/>
-                <w:bCs/>
-                <w:sz w:val="18"/>
-                <w:szCs w:val="18"/>
-                <w:lang w:eastAsia="ru-RU"/>
-              </w:rPr>
               <w:t>Формула</w:t>
             </w:r>
           </w:p>
         </w:tc>
         <w:tc>
           <w:tcPr>
-            <w:tcW w:w="1800" w:type="dxa"/>
+            <w:tcW w:w="1796" w:type="dxa"/>
             <w:vMerge w:val="restart"/>
             <w:tcBorders>
               <w:top w:val="single" w:sz="6" w:space="0" w:color="CCCCCC"/>
@@ -639,7 +637,7 @@
         <w:trPr/>
         <w:tc>
           <w:tcPr>
-            <w:tcW w:w="1809" w:type="dxa"/>
+            <w:tcW w:w="1701" w:type="dxa"/>
             <w:vMerge w:val="continue"/>
             <w:tcBorders>
               <w:top w:val="single" w:sz="6" w:space="0" w:color="CCCCCC"/>
@@ -682,7 +680,7 @@
         </w:tc>
         <w:tc>
           <w:tcPr>
-            <w:tcW w:w="1356" w:type="dxa"/>
+            <w:tcW w:w="1360" w:type="dxa"/>
             <w:vMerge w:val="continue"/>
             <w:tcBorders>
               <w:top w:val="single" w:sz="6" w:space="0" w:color="CCCCCC"/>
@@ -725,7 +723,7 @@
         </w:tc>
         <w:tc>
           <w:tcPr>
-            <w:tcW w:w="1360" w:type="dxa"/>
+            <w:tcW w:w="1474" w:type="dxa"/>
             <w:gridSpan w:val="2"/>
             <w:tcBorders>
               <w:top w:val="single" w:sz="6" w:space="0" w:color="CCCCCC"/>
@@ -764,7 +762,7 @@
         </w:tc>
         <w:tc>
           <w:tcPr>
-            <w:tcW w:w="1356" w:type="dxa"/>
+            <w:tcW w:w="1475" w:type="dxa"/>
             <w:tcBorders>
               <w:top w:val="single" w:sz="6" w:space="0" w:color="CCCCCC"/>
               <w:left w:val="single" w:sz="6" w:space="0" w:color="CCCCCC"/>
@@ -802,7 +800,7 @@
         </w:tc>
         <w:tc>
           <w:tcPr>
-            <w:tcW w:w="730" w:type="dxa"/>
+            <w:tcW w:w="878" w:type="dxa"/>
             <w:tcBorders>
               <w:top w:val="single" w:sz="6" w:space="0" w:color="CCCCCC"/>
               <w:left w:val="single" w:sz="6" w:space="0" w:color="CCCCCC"/>
@@ -840,8 +838,7 @@
         </w:tc>
         <w:tc>
           <w:tcPr>
-            <w:tcW w:w="1052" w:type="dxa"/>
-            <w:gridSpan w:val="2"/>
+            <w:tcW w:w="908" w:type="dxa"/>
             <w:vMerge w:val="continue"/>
             <w:tcBorders>
               <w:top w:val="single" w:sz="6" w:space="0" w:color="CCCCCC"/>
@@ -884,7 +881,7 @@
         </w:tc>
         <w:tc>
           <w:tcPr>
-            <w:tcW w:w="1667" w:type="dxa"/>
+            <w:tcW w:w="1589" w:type="dxa"/>
             <w:vMerge w:val="continue"/>
             <w:tcBorders>
               <w:top w:val="single" w:sz="6" w:space="0" w:color="CCCCCC"/>
@@ -927,7 +924,7 @@
         </w:tc>
         <w:tc>
           <w:tcPr>
-            <w:tcW w:w="3438" w:type="dxa"/>
+            <w:tcW w:w="3387" w:type="dxa"/>
             <w:gridSpan w:val="2"/>
             <w:vMerge w:val="continue"/>
             <w:tcBorders>
@@ -971,7 +968,7 @@
         </w:tc>
         <w:tc>
           <w:tcPr>
-            <w:tcW w:w="1800" w:type="dxa"/>
+            <w:tcW w:w="1796" w:type="dxa"/>
             <w:vMerge w:val="continue"/>
             <w:tcBorders>
               <w:top w:val="single" w:sz="6" w:space="0" w:color="CCCCCC"/>
@@ -1017,7 +1014,7 @@
         <w:trPr/>
         <w:tc>
           <w:tcPr>
-            <w:tcW w:w="1809" w:type="dxa"/>
+            <w:tcW w:w="1701" w:type="dxa"/>
             <w:vMerge w:val="restart"/>
             <w:tcBorders>
               <w:top w:val="single" w:sz="12" w:space="0" w:color="666666"/>
@@ -1056,7 +1053,8 @@
         </w:tc>
         <w:tc>
           <w:tcPr>
-            <w:tcW w:w="1356" w:type="dxa"/>
+            <w:tcW w:w="1361" w:type="dxa"/>
+            <w:gridSpan w:val="2"/>
             <w:tcBorders>
               <w:top w:val="single" w:sz="12" w:space="0" w:color="666666"/>
               <w:left w:val="single" w:sz="6" w:space="0" w:color="CCCCCC"/>
@@ -1091,8 +1089,7 @@
         </w:tc>
         <w:tc>
           <w:tcPr>
-            <w:tcW w:w="1360" w:type="dxa"/>
-            <w:gridSpan w:val="2"/>
+            <w:tcW w:w="1473" w:type="dxa"/>
             <w:tcBorders>
               <w:top w:val="single" w:sz="12" w:space="0" w:color="666666"/>
               <w:left w:val="single" w:sz="6" w:space="0" w:color="CCCCCC"/>
@@ -1127,8 +1124,8 @@
         </w:tc>
         <w:tc>
           <w:tcPr>
-            <w:tcW w:w="10043" w:type="dxa"/>
-            <w:gridSpan w:val="8"/>
+            <w:tcW w:w="10033" w:type="dxa"/>
+            <w:gridSpan w:val="7"/>
             <w:tcBorders>
               <w:top w:val="single" w:sz="12" w:space="0" w:color="666666"/>
               <w:left w:val="single" w:sz="6" w:space="0" w:color="CCCCCC"/>
@@ -1165,7 +1162,7 @@
         <w:trPr/>
         <w:tc>
           <w:tcPr>
-            <w:tcW w:w="1809" w:type="dxa"/>
+            <w:tcW w:w="1701" w:type="dxa"/>
             <w:vMerge w:val="continue"/>
             <w:tcBorders>
               <w:top w:val="single" w:sz="12" w:space="0" w:color="666666"/>
@@ -1208,7 +1205,8 @@
         </w:tc>
         <w:tc>
           <w:tcPr>
-            <w:tcW w:w="1356" w:type="dxa"/>
+            <w:tcW w:w="1361" w:type="dxa"/>
+            <w:gridSpan w:val="2"/>
             <w:tcBorders>
               <w:top w:val="single" w:sz="6" w:space="0" w:color="CCCCCC"/>
               <w:left w:val="single" w:sz="6" w:space="0" w:color="CCCCCC"/>
@@ -1241,8 +1239,7 @@
         </w:tc>
         <w:tc>
           <w:tcPr>
-            <w:tcW w:w="1360" w:type="dxa"/>
-            <w:gridSpan w:val="2"/>
+            <w:tcW w:w="1473" w:type="dxa"/>
             <w:tcBorders>
               <w:top w:val="single" w:sz="6" w:space="0" w:color="CCCCCC"/>
               <w:left w:val="single" w:sz="6" w:space="0" w:color="CCCCCC"/>
@@ -1275,7 +1272,7 @@
         </w:tc>
         <w:tc>
           <w:tcPr>
-            <w:tcW w:w="1356" w:type="dxa"/>
+            <w:tcW w:w="1475" w:type="dxa"/>
             <w:tcBorders>
               <w:top w:val="single" w:sz="6" w:space="0" w:color="CCCCCC"/>
               <w:left w:val="single" w:sz="6" w:space="0" w:color="CCCCCC"/>
@@ -1308,7 +1305,7 @@
         </w:tc>
         <w:tc>
           <w:tcPr>
-            <w:tcW w:w="730" w:type="dxa"/>
+            <w:tcW w:w="878" w:type="dxa"/>
             <w:tcBorders>
               <w:top w:val="single" w:sz="6" w:space="0" w:color="CCCCCC"/>
               <w:left w:val="single" w:sz="6" w:space="0" w:color="CCCCCC"/>
@@ -1341,8 +1338,7 @@
         </w:tc>
         <w:tc>
           <w:tcPr>
-            <w:tcW w:w="1052" w:type="dxa"/>
-            <w:gridSpan w:val="2"/>
+            <w:tcW w:w="908" w:type="dxa"/>
             <w:tcBorders>
               <w:top w:val="single" w:sz="6" w:space="0" w:color="CCCCCC"/>
               <w:left w:val="single" w:sz="6" w:space="0" w:color="CCCCCC"/>
@@ -1375,7 +1371,7 @@
         </w:tc>
         <w:tc>
           <w:tcPr>
-            <w:tcW w:w="1667" w:type="dxa"/>
+            <w:tcW w:w="1589" w:type="dxa"/>
             <w:tcBorders>
               <w:top w:val="single" w:sz="6" w:space="0" w:color="CCCCCC"/>
               <w:left w:val="single" w:sz="6" w:space="0" w:color="CCCCCC"/>
@@ -1408,7 +1404,7 @@
         </w:tc>
         <w:tc>
           <w:tcPr>
-            <w:tcW w:w="3438" w:type="dxa"/>
+            <w:tcW w:w="3387" w:type="dxa"/>
             <w:gridSpan w:val="2"/>
             <w:tcBorders>
               <w:top w:val="single" w:sz="6" w:space="0" w:color="CCCCCC"/>
@@ -1441,7 +1437,7 @@
         </w:tc>
         <w:tc>
           <w:tcPr>
-            <w:tcW w:w="1800" w:type="dxa"/>
+            <w:tcW w:w="1796" w:type="dxa"/>
             <w:tcBorders>
               <w:top w:val="single" w:sz="6" w:space="0" w:color="CCCCCC"/>
               <w:left w:val="single" w:sz="6" w:space="0" w:color="CCCCCC"/>
@@ -1477,7 +1473,7 @@
         <w:trPr/>
         <w:tc>
           <w:tcPr>
-            <w:tcW w:w="1809" w:type="dxa"/>
+            <w:tcW w:w="1701" w:type="dxa"/>
             <w:vMerge w:val="continue"/>
             <w:tcBorders>
               <w:top w:val="single" w:sz="12" w:space="0" w:color="666666"/>
@@ -1520,7 +1516,8 @@
         </w:tc>
         <w:tc>
           <w:tcPr>
-            <w:tcW w:w="1356" w:type="dxa"/>
+            <w:tcW w:w="1361" w:type="dxa"/>
+            <w:gridSpan w:val="2"/>
             <w:tcBorders>
               <w:top w:val="single" w:sz="6" w:space="0" w:color="CCCCCC"/>
               <w:left w:val="single" w:sz="6" w:space="0" w:color="CCCCCC"/>
@@ -1555,8 +1552,7 @@
         </w:tc>
         <w:tc>
           <w:tcPr>
-            <w:tcW w:w="1360" w:type="dxa"/>
-            <w:gridSpan w:val="2"/>
+            <w:tcW w:w="1473" w:type="dxa"/>
             <w:tcBorders>
               <w:top w:val="single" w:sz="6" w:space="0" w:color="CCCCCC"/>
               <w:left w:val="single" w:sz="6" w:space="0" w:color="CCCCCC"/>
@@ -1591,8 +1587,8 @@
         </w:tc>
         <w:tc>
           <w:tcPr>
-            <w:tcW w:w="10043" w:type="dxa"/>
-            <w:gridSpan w:val="8"/>
+            <w:tcW w:w="10033" w:type="dxa"/>
+            <w:gridSpan w:val="7"/>
             <w:tcBorders>
               <w:top w:val="single" w:sz="6" w:space="0" w:color="CCCCCC"/>
               <w:left w:val="single" w:sz="6" w:space="0" w:color="CCCCCC"/>
@@ -1629,7 +1625,7 @@
         <w:trPr/>
         <w:tc>
           <w:tcPr>
-            <w:tcW w:w="1809" w:type="dxa"/>
+            <w:tcW w:w="1701" w:type="dxa"/>
             <w:vMerge w:val="continue"/>
             <w:tcBorders>
               <w:top w:val="single" w:sz="12" w:space="0" w:color="666666"/>
@@ -1672,7 +1668,8 @@
         </w:tc>
         <w:tc>
           <w:tcPr>
-            <w:tcW w:w="1356" w:type="dxa"/>
+            <w:tcW w:w="1361" w:type="dxa"/>
+            <w:gridSpan w:val="2"/>
             <w:tcBorders>
               <w:top w:val="single" w:sz="6" w:space="0" w:color="CCCCCC"/>
               <w:left w:val="single" w:sz="6" w:space="0" w:color="CCCCCC"/>
@@ -1704,7 +1701,167 @@
         </w:tc>
         <w:tc>
           <w:tcPr>
-            <w:tcW w:w="1360" w:type="dxa"/>
+            <w:tcW w:w="1473" w:type="dxa"/>
+            <w:tcBorders>
+              <w:top w:val="single" w:sz="6" w:space="0" w:color="CCCCCC"/>
+              <w:left w:val="single" w:sz="6" w:space="0" w:color="CCCCCC"/>
+              <w:bottom w:val="single" w:sz="6" w:space="0" w:color="CCCCCC"/>
+              <w:right w:val="single" w:sz="6" w:space="0" w:color="CCCCCC"/>
+            </w:tcBorders>
+          </w:tcPr>
+          <w:p>
+            <w:pPr>
+              <w:pStyle w:val="Normal"/>
+              <w:spacing w:lineRule="auto" w:line="240" w:before="0" w:after="0"/>
+              <w:jc w:val="center"/>
+              <w:rPr>
+                <w:rFonts w:ascii="Times New Roman" w:hAnsi="Times New Roman" w:eastAsia="Times New Roman" w:cs="Times New Roman"/>
+                <w:sz w:val="18"/>
+                <w:szCs w:val="18"/>
+                <w:lang w:eastAsia="ru-RU"/>
+              </w:rPr>
+            </w:pPr>
+            <w:r>
+              <w:rPr>
+                <w:rFonts w:eastAsia="Times New Roman" w:cs="Times New Roman" w:ascii="Times New Roman" w:hAnsi="Times New Roman"/>
+                <w:sz w:val="18"/>
+                <w:szCs w:val="18"/>
+                <w:lang w:eastAsia="ru-RU"/>
+              </w:rPr>
+            </w:r>
+          </w:p>
+        </w:tc>
+        <w:tc>
+          <w:tcPr>
+            <w:tcW w:w="1475" w:type="dxa"/>
+            <w:tcBorders>
+              <w:top w:val="single" w:sz="6" w:space="0" w:color="CCCCCC"/>
+              <w:left w:val="single" w:sz="6" w:space="0" w:color="CCCCCC"/>
+              <w:bottom w:val="single" w:sz="6" w:space="0" w:color="CCCCCC"/>
+              <w:right w:val="single" w:sz="6" w:space="0" w:color="CCCCCC"/>
+            </w:tcBorders>
+          </w:tcPr>
+          <w:p>
+            <w:pPr>
+              <w:pStyle w:val="Normal"/>
+              <w:spacing w:lineRule="auto" w:line="240" w:before="0" w:after="0"/>
+              <w:jc w:val="center"/>
+              <w:rPr>
+                <w:rFonts w:ascii="Times New Roman" w:hAnsi="Times New Roman" w:eastAsia="Times New Roman" w:cs="Times New Roman"/>
+                <w:sz w:val="18"/>
+                <w:szCs w:val="18"/>
+                <w:lang w:eastAsia="ru-RU"/>
+              </w:rPr>
+            </w:pPr>
+            <w:r>
+              <w:rPr>
+                <w:rFonts w:eastAsia="Times New Roman" w:cs="Times New Roman" w:ascii="Times New Roman" w:hAnsi="Times New Roman"/>
+                <w:sz w:val="18"/>
+                <w:szCs w:val="18"/>
+                <w:lang w:eastAsia="ru-RU"/>
+              </w:rPr>
+            </w:r>
+          </w:p>
+        </w:tc>
+        <w:tc>
+          <w:tcPr>
+            <w:tcW w:w="878" w:type="dxa"/>
+            <w:tcBorders>
+              <w:top w:val="single" w:sz="6" w:space="0" w:color="CCCCCC"/>
+              <w:left w:val="single" w:sz="6" w:space="0" w:color="CCCCCC"/>
+              <w:bottom w:val="single" w:sz="6" w:space="0" w:color="CCCCCC"/>
+              <w:right w:val="single" w:sz="6" w:space="0" w:color="CCCCCC"/>
+            </w:tcBorders>
+          </w:tcPr>
+          <w:p>
+            <w:pPr>
+              <w:pStyle w:val="Normal"/>
+              <w:spacing w:lineRule="auto" w:line="240" w:before="0" w:after="0"/>
+              <w:jc w:val="center"/>
+              <w:rPr>
+                <w:rFonts w:ascii="Times New Roman" w:hAnsi="Times New Roman" w:eastAsia="Times New Roman" w:cs="Times New Roman"/>
+                <w:sz w:val="18"/>
+                <w:szCs w:val="18"/>
+                <w:lang w:eastAsia="ru-RU"/>
+              </w:rPr>
+            </w:pPr>
+            <w:r>
+              <w:rPr>
+                <w:rFonts w:eastAsia="Times New Roman" w:cs="Times New Roman" w:ascii="Times New Roman" w:hAnsi="Times New Roman"/>
+                <w:sz w:val="18"/>
+                <w:szCs w:val="18"/>
+                <w:lang w:eastAsia="ru-RU"/>
+              </w:rPr>
+            </w:r>
+          </w:p>
+        </w:tc>
+        <w:tc>
+          <w:tcPr>
+            <w:tcW w:w="908" w:type="dxa"/>
+            <w:tcBorders>
+              <w:top w:val="single" w:sz="6" w:space="0" w:color="CCCCCC"/>
+              <w:left w:val="single" w:sz="6" w:space="0" w:color="CCCCCC"/>
+              <w:bottom w:val="single" w:sz="6" w:space="0" w:color="CCCCCC"/>
+              <w:right w:val="single" w:sz="6" w:space="0" w:color="CCCCCC"/>
+            </w:tcBorders>
+          </w:tcPr>
+          <w:p>
+            <w:pPr>
+              <w:pStyle w:val="Normal"/>
+              <w:spacing w:lineRule="auto" w:line="240" w:before="0" w:after="0"/>
+              <w:jc w:val="center"/>
+              <w:rPr>
+                <w:rFonts w:ascii="Times New Roman" w:hAnsi="Times New Roman" w:eastAsia="Times New Roman" w:cs="Times New Roman"/>
+                <w:sz w:val="18"/>
+                <w:szCs w:val="18"/>
+                <w:lang w:eastAsia="ru-RU"/>
+              </w:rPr>
+            </w:pPr>
+            <w:r>
+              <w:rPr>
+                <w:rFonts w:eastAsia="Times New Roman" w:cs="Times New Roman" w:ascii="Times New Roman" w:hAnsi="Times New Roman"/>
+                <w:sz w:val="18"/>
+                <w:szCs w:val="18"/>
+                <w:lang w:eastAsia="ru-RU"/>
+              </w:rPr>
+            </w:r>
+          </w:p>
+        </w:tc>
+        <w:tc>
+          <w:tcPr>
+            <w:tcW w:w="1589" w:type="dxa"/>
+            <w:tcBorders>
+              <w:top w:val="single" w:sz="6" w:space="0" w:color="CCCCCC"/>
+              <w:left w:val="single" w:sz="6" w:space="0" w:color="CCCCCC"/>
+              <w:bottom w:val="single" w:sz="6" w:space="0" w:color="CCCCCC"/>
+              <w:right w:val="single" w:sz="6" w:space="0" w:color="CCCCCC"/>
+            </w:tcBorders>
+          </w:tcPr>
+          <w:p>
+            <w:pPr>
+              <w:pStyle w:val="Normal"/>
+              <w:spacing w:lineRule="auto" w:line="240" w:before="0" w:after="0"/>
+              <w:jc w:val="center"/>
+              <w:rPr>
+                <w:rFonts w:ascii="Times New Roman" w:hAnsi="Times New Roman" w:eastAsia="Times New Roman" w:cs="Times New Roman"/>
+                <w:sz w:val="18"/>
+                <w:szCs w:val="18"/>
+                <w:lang w:eastAsia="ru-RU"/>
+              </w:rPr>
+            </w:pPr>
+            <w:r>
+              <w:rPr>
+                <w:rFonts w:eastAsia="Times New Roman" w:cs="Times New Roman" w:ascii="Times New Roman" w:hAnsi="Times New Roman"/>
+                <w:sz w:val="18"/>
+                <w:szCs w:val="18"/>
+                <w:lang w:eastAsia="ru-RU"/>
+              </w:rPr>
+            </w:r>
+          </w:p>
+        </w:tc>
+        <w:tc>
+          <w:tcPr>
+            <w:tcW w:w="3387" w:type="dxa"/>
             <w:gridSpan w:val="2"/>
             <w:tcBorders>
               <w:top w:val="single" w:sz="6" w:space="0" w:color="CCCCCC"/>
@@ -1712,168 +1869,6 @@
               <w:bottom w:val="single" w:sz="6" w:space="0" w:color="CCCCCC"/>
               <w:right w:val="single" w:sz="6" w:space="0" w:color="CCCCCC"/>
             </w:tcBorders>
-          </w:tcPr>
-          <w:p>
-            <w:pPr>
-              <w:pStyle w:val="Normal"/>
-              <w:spacing w:lineRule="auto" w:line="240" w:before="0" w:after="0"/>
-              <w:jc w:val="center"/>
-              <w:rPr>
-                <w:rFonts w:ascii="Times New Roman" w:hAnsi="Times New Roman" w:eastAsia="Times New Roman" w:cs="Times New Roman"/>
-                <w:sz w:val="18"/>
-                <w:szCs w:val="18"/>
-                <w:lang w:eastAsia="ru-RU"/>
-              </w:rPr>
-            </w:pPr>
-            <w:r>
-              <w:rPr>
-                <w:rFonts w:eastAsia="Times New Roman" w:cs="Times New Roman" w:ascii="Times New Roman" w:hAnsi="Times New Roman"/>
-                <w:sz w:val="18"/>
-                <w:szCs w:val="18"/>
-                <w:lang w:eastAsia="ru-RU"/>
-              </w:rPr>
-            </w:r>
-          </w:p>
-        </w:tc>
-        <w:tc>
-          <w:tcPr>
-            <w:tcW w:w="1356" w:type="dxa"/>
-            <w:tcBorders>
-              <w:top w:val="single" w:sz="6" w:space="0" w:color="CCCCCC"/>
-              <w:left w:val="single" w:sz="6" w:space="0" w:color="CCCCCC"/>
-              <w:bottom w:val="single" w:sz="6" w:space="0" w:color="CCCCCC"/>
-              <w:right w:val="single" w:sz="6" w:space="0" w:color="CCCCCC"/>
-            </w:tcBorders>
-          </w:tcPr>
-          <w:p>
-            <w:pPr>
-              <w:pStyle w:val="Normal"/>
-              <w:spacing w:lineRule="auto" w:line="240" w:before="0" w:after="0"/>
-              <w:jc w:val="center"/>
-              <w:rPr>
-                <w:rFonts w:ascii="Times New Roman" w:hAnsi="Times New Roman" w:eastAsia="Times New Roman" w:cs="Times New Roman"/>
-                <w:sz w:val="18"/>
-                <w:szCs w:val="18"/>
-                <w:lang w:eastAsia="ru-RU"/>
-              </w:rPr>
-            </w:pPr>
-            <w:r>
-              <w:rPr>
-                <w:rFonts w:eastAsia="Times New Roman" w:cs="Times New Roman" w:ascii="Times New Roman" w:hAnsi="Times New Roman"/>
-                <w:sz w:val="18"/>
-                <w:szCs w:val="18"/>
-                <w:lang w:eastAsia="ru-RU"/>
-              </w:rPr>
-            </w:r>
-          </w:p>
-        </w:tc>
-        <w:tc>
-          <w:tcPr>
-            <w:tcW w:w="730" w:type="dxa"/>
-            <w:tcBorders>
-              <w:top w:val="single" w:sz="6" w:space="0" w:color="CCCCCC"/>
-              <w:left w:val="single" w:sz="6" w:space="0" w:color="CCCCCC"/>
-              <w:bottom w:val="single" w:sz="6" w:space="0" w:color="CCCCCC"/>
-              <w:right w:val="single" w:sz="6" w:space="0" w:color="CCCCCC"/>
-            </w:tcBorders>
-          </w:tcPr>
-          <w:p>
-            <w:pPr>
-              <w:pStyle w:val="Normal"/>
-              <w:spacing w:lineRule="auto" w:line="240" w:before="0" w:after="0"/>
-              <w:jc w:val="center"/>
-              <w:rPr>
-                <w:rFonts w:ascii="Times New Roman" w:hAnsi="Times New Roman" w:eastAsia="Times New Roman" w:cs="Times New Roman"/>
-                <w:sz w:val="18"/>
-                <w:szCs w:val="18"/>
-                <w:lang w:eastAsia="ru-RU"/>
-              </w:rPr>
-            </w:pPr>
-            <w:r>
-              <w:rPr>
-                <w:rFonts w:eastAsia="Times New Roman" w:cs="Times New Roman" w:ascii="Times New Roman" w:hAnsi="Times New Roman"/>
-                <w:sz w:val="18"/>
-                <w:szCs w:val="18"/>
-                <w:lang w:eastAsia="ru-RU"/>
-              </w:rPr>
-            </w:r>
-          </w:p>
-        </w:tc>
-        <w:tc>
-          <w:tcPr>
-            <w:tcW w:w="1052" w:type="dxa"/>
-            <w:gridSpan w:val="2"/>
-            <w:tcBorders>
-              <w:top w:val="single" w:sz="6" w:space="0" w:color="CCCCCC"/>
-              <w:left w:val="single" w:sz="6" w:space="0" w:color="CCCCCC"/>
-              <w:bottom w:val="single" w:sz="6" w:space="0" w:color="CCCCCC"/>
-              <w:right w:val="single" w:sz="6" w:space="0" w:color="CCCCCC"/>
-            </w:tcBorders>
-          </w:tcPr>
-          <w:p>
-            <w:pPr>
-              <w:pStyle w:val="Normal"/>
-              <w:spacing w:lineRule="auto" w:line="240" w:before="0" w:after="0"/>
-              <w:jc w:val="center"/>
-              <w:rPr>
-                <w:rFonts w:ascii="Times New Roman" w:hAnsi="Times New Roman" w:eastAsia="Times New Roman" w:cs="Times New Roman"/>
-                <w:sz w:val="18"/>
-                <w:szCs w:val="18"/>
-                <w:lang w:eastAsia="ru-RU"/>
-              </w:rPr>
-            </w:pPr>
-            <w:r>
-              <w:rPr>
-                <w:rFonts w:eastAsia="Times New Roman" w:cs="Times New Roman" w:ascii="Times New Roman" w:hAnsi="Times New Roman"/>
-                <w:sz w:val="18"/>
-                <w:szCs w:val="18"/>
-                <w:lang w:eastAsia="ru-RU"/>
-              </w:rPr>
-            </w:r>
-          </w:p>
-        </w:tc>
-        <w:tc>
-          <w:tcPr>
-            <w:tcW w:w="1667" w:type="dxa"/>
-            <w:tcBorders>
-              <w:top w:val="single" w:sz="6" w:space="0" w:color="CCCCCC"/>
-              <w:left w:val="single" w:sz="6" w:space="0" w:color="CCCCCC"/>
-              <w:bottom w:val="single" w:sz="6" w:space="0" w:color="CCCCCC"/>
-              <w:right w:val="single" w:sz="6" w:space="0" w:color="CCCCCC"/>
-            </w:tcBorders>
-          </w:tcPr>
-          <w:p>
-            <w:pPr>
-              <w:pStyle w:val="Normal"/>
-              <w:spacing w:lineRule="auto" w:line="240" w:before="0" w:after="0"/>
-              <w:jc w:val="center"/>
-              <w:rPr>
-                <w:rFonts w:ascii="Times New Roman" w:hAnsi="Times New Roman" w:eastAsia="Times New Roman" w:cs="Times New Roman"/>
-                <w:sz w:val="18"/>
-                <w:szCs w:val="18"/>
-                <w:lang w:eastAsia="ru-RU"/>
-              </w:rPr>
-            </w:pPr>
-            <w:r>
-              <w:rPr>
-                <w:rFonts w:eastAsia="Times New Roman" w:cs="Times New Roman" w:ascii="Times New Roman" w:hAnsi="Times New Roman"/>
-                <w:sz w:val="18"/>
-                <w:szCs w:val="18"/>
-                <w:lang w:eastAsia="ru-RU"/>
-              </w:rPr>
-            </w:r>
-          </w:p>
-        </w:tc>
-        <w:tc>
-          <w:tcPr>
-            <w:tcW w:w="3438" w:type="dxa"/>
-            <w:gridSpan w:val="2"/>
-            <w:tcBorders>
-              <w:top w:val="single" w:sz="6" w:space="0" w:color="CCCCCC"/>
-              <w:left w:val="single" w:sz="6" w:space="0" w:color="CCCCCC"/>
-              <w:bottom w:val="single" w:sz="6" w:space="0" w:color="CCCCCC"/>
-              <w:right w:val="single" w:sz="6" w:space="0" w:color="CCCCCC"/>
-            </w:tcBorders>
             <w:vAlign w:val="center"/>
           </w:tcPr>
           <w:p>
@@ -1903,7 +1898,7 @@
         </w:tc>
         <w:tc>
           <w:tcPr>
-            <w:tcW w:w="1800" w:type="dxa"/>
+            <w:tcW w:w="1796" w:type="dxa"/>
             <w:tcBorders>
               <w:top w:val="single" w:sz="6" w:space="0" w:color="CCCCCC"/>
               <w:left w:val="single" w:sz="6" w:space="0" w:color="CCCCCC"/>
@@ -1943,7 +1938,7 @@
         <w:tc>
           <w:tcPr>
             <w:tcW w:w="14568" w:type="dxa"/>
-            <w:gridSpan w:val="12"/>
+            <w:gridSpan w:val="11"/>
             <w:tcBorders>
               <w:top w:val="single" w:sz="12" w:space="0" w:color="808080"/>
               <w:left w:val="single" w:sz="6" w:space="0" w:color="CCCCCC"/>
@@ -1980,7 +1975,7 @@
         <w:tc>
           <w:tcPr>
             <w:tcW w:w="14568" w:type="dxa"/>
-            <w:gridSpan w:val="12"/>
+            <w:gridSpan w:val="11"/>
             <w:tcBorders>
               <w:top w:val="single" w:sz="6" w:space="0" w:color="CCCCCC"/>
               <w:left w:val="single" w:sz="6" w:space="0" w:color="CCCCCC"/>
@@ -2478,7 +2473,7 @@
                 <w:szCs w:val="22"/>
                 <w:lang w:val="ru-RU" w:eastAsia="ru-RU" w:bidi="ar-SA"/>
               </w:rPr>
-              <w:t>Договор /*номер договора*/</w:t>
+              <w:t>/*номер договора*/</w:t>
             </w:r>
           </w:p>
         </w:tc>

</xml_diff>

<commit_message>
make double borders in table in calculation_claim
</commit_message>
<xml_diff>
--- a/data/templates/calculation_claim.docx
+++ b/data/templates/calculation_claim.docx
@@ -2185,14 +2185,14 @@
         <w:tc>
           <w:tcPr>
             <w:tcW w:w="3544" w:type="dxa"/>
-            <w:tcBorders>
-              <w:top w:val="single" w:sz="4" w:space="0" w:color="000000"/>
-              <w:left w:val="single" w:sz="4" w:space="0" w:color="000000"/>
-              <w:bottom w:val="single" w:sz="4" w:space="0" w:color="000000"/>
-              <w:right w:val="single" w:sz="4" w:space="0" w:color="000000"/>
-            </w:tcBorders>
             <w:shd w:color="auto" w:fill="auto" w:val="clear"/>
             <w:vAlign w:val="center"/>
+            <w:tcBorders>
+              <w:top w:val="double" w:sz="4" w:space="0" w:color="auto"/>
+              <w:left w:val="double" w:sz="4" w:space="0" w:color="auto"/>
+              <w:bottom w:val="double" w:sz="4" w:space="0" w:color="auto"/>
+              <w:right w:val="double" w:sz="4" w:space="0" w:color="auto"/>
+            </w:tcBorders>
           </w:tcPr>
           <w:p>
             <w:pPr>
@@ -2218,14 +2218,14 @@
         <w:tc>
           <w:tcPr>
             <w:tcW w:w="1843" w:type="dxa"/>
-            <w:tcBorders>
-              <w:top w:val="single" w:sz="4" w:space="0" w:color="000000"/>
-              <w:left w:val="single" w:sz="4" w:space="0" w:color="000000"/>
-              <w:bottom w:val="single" w:sz="4" w:space="0" w:color="000000"/>
-              <w:right w:val="single" w:sz="4" w:space="0" w:color="000000"/>
-            </w:tcBorders>
             <w:shd w:color="auto" w:fill="auto" w:val="clear"/>
             <w:vAlign w:val="center"/>
+            <w:tcBorders>
+              <w:top w:val="double" w:sz="4" w:space="0" w:color="auto"/>
+              <w:left w:val="double" w:sz="4" w:space="0" w:color="auto"/>
+              <w:bottom w:val="double" w:sz="4" w:space="0" w:color="auto"/>
+              <w:right w:val="double" w:sz="4" w:space="0" w:color="auto"/>
+            </w:tcBorders>
           </w:tcPr>
           <w:p>
             <w:pPr>
@@ -2251,14 +2251,14 @@
         <w:tc>
           <w:tcPr>
             <w:tcW w:w="2835" w:type="dxa"/>
-            <w:tcBorders>
-              <w:top w:val="single" w:sz="4" w:space="0" w:color="000000"/>
-              <w:left w:val="single" w:sz="4" w:space="0" w:color="000000"/>
-              <w:bottom w:val="single" w:sz="4" w:space="0" w:color="000000"/>
-              <w:right w:val="single" w:sz="4" w:space="0" w:color="000000"/>
-            </w:tcBorders>
             <w:shd w:color="auto" w:fill="auto" w:val="clear"/>
             <w:vAlign w:val="center"/>
+            <w:tcBorders>
+              <w:top w:val="double" w:sz="4" w:space="0" w:color="auto"/>
+              <w:left w:val="double" w:sz="4" w:space="0" w:color="auto"/>
+              <w:bottom w:val="double" w:sz="4" w:space="0" w:color="auto"/>
+              <w:right w:val="double" w:sz="4" w:space="0" w:color="auto"/>
+            </w:tcBorders>
           </w:tcPr>
           <w:p>
             <w:pPr>
@@ -2284,14 +2284,14 @@
         <w:tc>
           <w:tcPr>
             <w:tcW w:w="1699" w:type="dxa"/>
-            <w:tcBorders>
-              <w:top w:val="single" w:sz="4" w:space="0" w:color="000000"/>
-              <w:left w:val="single" w:sz="4" w:space="0" w:color="000000"/>
-              <w:bottom w:val="single" w:sz="4" w:space="0" w:color="000000"/>
-              <w:right w:val="single" w:sz="4" w:space="0" w:color="000000"/>
-            </w:tcBorders>
             <w:shd w:color="auto" w:fill="auto" w:val="clear"/>
             <w:vAlign w:val="center"/>
+            <w:tcBorders>
+              <w:top w:val="double" w:sz="4" w:space="0" w:color="auto"/>
+              <w:left w:val="double" w:sz="4" w:space="0" w:color="auto"/>
+              <w:bottom w:val="double" w:sz="4" w:space="0" w:color="auto"/>
+              <w:right w:val="double" w:sz="4" w:space="0" w:color="auto"/>
+            </w:tcBorders>
           </w:tcPr>
           <w:p>
             <w:pPr>
@@ -2346,14 +2346,14 @@
         <w:tc>
           <w:tcPr>
             <w:tcW w:w="4652" w:type="dxa"/>
-            <w:tcBorders>
-              <w:top w:val="single" w:sz="4" w:space="0" w:color="000000"/>
-              <w:left w:val="single" w:sz="4" w:space="0" w:color="000000"/>
-              <w:bottom w:val="single" w:sz="4" w:space="0" w:color="000000"/>
-              <w:right w:val="single" w:sz="4" w:space="0" w:color="000000"/>
-            </w:tcBorders>
             <w:shd w:color="auto" w:fill="auto" w:val="clear"/>
             <w:vAlign w:val="center"/>
+            <w:tcBorders>
+              <w:top w:val="double" w:sz="4" w:space="0" w:color="auto"/>
+              <w:left w:val="double" w:sz="4" w:space="0" w:color="auto"/>
+              <w:bottom w:val="double" w:sz="4" w:space="0" w:color="auto"/>
+              <w:right w:val="double" w:sz="4" w:space="0" w:color="auto"/>
+            </w:tcBorders>
           </w:tcPr>
           <w:p>
             <w:pPr>
@@ -2386,14 +2386,14 @@
         <w:tc>
           <w:tcPr>
             <w:tcW w:w="3544" w:type="dxa"/>
-            <w:tcBorders>
-              <w:top w:val="single" w:sz="4" w:space="0" w:color="000000"/>
-              <w:left w:val="single" w:sz="4" w:space="0" w:color="000000"/>
-              <w:bottom w:val="single" w:sz="4" w:space="0" w:color="000000"/>
-              <w:right w:val="single" w:sz="4" w:space="0" w:color="000000"/>
-            </w:tcBorders>
             <w:shd w:color="auto" w:fill="auto" w:val="clear"/>
             <w:vAlign w:val="center"/>
+            <w:tcBorders>
+              <w:top w:val="double" w:sz="4" w:space="0" w:color="auto"/>
+              <w:left w:val="double" w:sz="4" w:space="0" w:color="auto"/>
+              <w:bottom w:val="double" w:sz="4" w:space="0" w:color="auto"/>
+              <w:right w:val="double" w:sz="4" w:space="0" w:color="auto"/>
+            </w:tcBorders>
           </w:tcPr>
           <w:p>
             <w:pPr>
@@ -2422,14 +2422,14 @@
         <w:tc>
           <w:tcPr>
             <w:tcW w:w="1843" w:type="dxa"/>
-            <w:tcBorders>
-              <w:top w:val="single" w:sz="4" w:space="0" w:color="000000"/>
-              <w:left w:val="single" w:sz="4" w:space="0" w:color="000000"/>
-              <w:bottom w:val="single" w:sz="4" w:space="0" w:color="000000"/>
-              <w:right w:val="single" w:sz="4" w:space="0" w:color="000000"/>
-            </w:tcBorders>
             <w:shd w:color="auto" w:fill="auto" w:val="clear"/>
             <w:vAlign w:val="center"/>
+            <w:tcBorders>
+              <w:top w:val="double" w:sz="4" w:space="0" w:color="auto"/>
+              <w:left w:val="double" w:sz="4" w:space="0" w:color="auto"/>
+              <w:bottom w:val="double" w:sz="4" w:space="0" w:color="auto"/>
+              <w:right w:val="double" w:sz="4" w:space="0" w:color="auto"/>
+            </w:tcBorders>
           </w:tcPr>
           <w:p>
             <w:pPr>
@@ -2458,14 +2458,14 @@
         <w:tc>
           <w:tcPr>
             <w:tcW w:w="2835" w:type="dxa"/>
-            <w:tcBorders>
-              <w:top w:val="single" w:sz="4" w:space="0" w:color="000000"/>
-              <w:left w:val="single" w:sz="4" w:space="0" w:color="000000"/>
-              <w:bottom w:val="single" w:sz="4" w:space="0" w:color="000000"/>
-              <w:right w:val="single" w:sz="4" w:space="0" w:color="000000"/>
-            </w:tcBorders>
             <w:shd w:color="auto" w:fill="auto" w:val="clear"/>
             <w:vAlign w:val="center"/>
+            <w:tcBorders>
+              <w:top w:val="double" w:sz="4" w:space="0" w:color="auto"/>
+              <w:left w:val="double" w:sz="4" w:space="0" w:color="auto"/>
+              <w:bottom w:val="double" w:sz="4" w:space="0" w:color="auto"/>
+              <w:right w:val="double" w:sz="4" w:space="0" w:color="auto"/>
+            </w:tcBorders>
           </w:tcPr>
           <w:p>
             <w:pPr>
@@ -2506,14 +2506,14 @@
         <w:tc>
           <w:tcPr>
             <w:tcW w:w="1699" w:type="dxa"/>
-            <w:tcBorders>
-              <w:top w:val="single" w:sz="4" w:space="0" w:color="000000"/>
-              <w:left w:val="single" w:sz="4" w:space="0" w:color="000000"/>
-              <w:bottom w:val="single" w:sz="4" w:space="0" w:color="000000"/>
-              <w:right w:val="single" w:sz="4" w:space="0" w:color="000000"/>
-            </w:tcBorders>
             <w:shd w:color="auto" w:fill="auto" w:val="clear"/>
             <w:vAlign w:val="center"/>
+            <w:tcBorders>
+              <w:top w:val="double" w:sz="4" w:space="0" w:color="auto"/>
+              <w:left w:val="double" w:sz="4" w:space="0" w:color="auto"/>
+              <w:bottom w:val="double" w:sz="4" w:space="0" w:color="auto"/>
+              <w:right w:val="double" w:sz="4" w:space="0" w:color="auto"/>
+            </w:tcBorders>
           </w:tcPr>
           <w:p>
             <w:pPr>
@@ -2554,14 +2554,14 @@
         <w:tc>
           <w:tcPr>
             <w:tcW w:w="4652" w:type="dxa"/>
-            <w:tcBorders>
-              <w:top w:val="single" w:sz="4" w:space="0" w:color="000000"/>
-              <w:left w:val="single" w:sz="4" w:space="0" w:color="000000"/>
-              <w:bottom w:val="single" w:sz="4" w:space="0" w:color="000000"/>
-              <w:right w:val="single" w:sz="4" w:space="0" w:color="000000"/>
-            </w:tcBorders>
             <w:shd w:color="auto" w:fill="auto" w:val="clear"/>
             <w:vAlign w:val="center"/>
+            <w:tcBorders>
+              <w:top w:val="double" w:sz="4" w:space="0" w:color="auto"/>
+              <w:left w:val="double" w:sz="4" w:space="0" w:color="auto"/>
+              <w:bottom w:val="double" w:sz="4" w:space="0" w:color="auto"/>
+              <w:right w:val="double" w:sz="4" w:space="0" w:color="auto"/>
+            </w:tcBorders>
           </w:tcPr>
           <w:p>
             <w:pPr>
@@ -2608,14 +2608,14 @@
           <w:tcPr>
             <w:tcW w:w="5387" w:type="dxa"/>
             <w:gridSpan w:val="2"/>
-            <w:tcBorders>
-              <w:top w:val="single" w:sz="4" w:space="0" w:color="000000"/>
-              <w:left w:val="single" w:sz="4" w:space="0" w:color="000000"/>
-              <w:bottom w:val="single" w:sz="4" w:space="0" w:color="000000"/>
-              <w:right w:val="single" w:sz="4" w:space="0" w:color="000000"/>
-            </w:tcBorders>
             <w:shd w:color="auto" w:fill="auto" w:val="clear"/>
             <w:vAlign w:val="center"/>
+            <w:tcBorders>
+              <w:top w:val="double" w:sz="4" w:space="0" w:color="auto"/>
+              <w:left w:val="double" w:sz="4" w:space="0" w:color="auto"/>
+              <w:bottom w:val="double" w:sz="4" w:space="0" w:color="auto"/>
+              <w:right w:val="double" w:sz="4" w:space="0" w:color="auto"/>
+            </w:tcBorders>
           </w:tcPr>
           <w:p>
             <w:pPr>
@@ -2644,14 +2644,14 @@
         <w:tc>
           <w:tcPr>
             <w:tcW w:w="2835" w:type="dxa"/>
-            <w:tcBorders>
-              <w:top w:val="single" w:sz="4" w:space="0" w:color="000000"/>
-              <w:left w:val="single" w:sz="4" w:space="0" w:color="000000"/>
-              <w:bottom w:val="single" w:sz="4" w:space="0" w:color="000000"/>
-              <w:right w:val="single" w:sz="4" w:space="0" w:color="000000"/>
-            </w:tcBorders>
             <w:shd w:color="auto" w:fill="auto" w:val="clear"/>
             <w:vAlign w:val="center"/>
+            <w:tcBorders>
+              <w:top w:val="double" w:sz="4" w:space="0" w:color="auto"/>
+              <w:left w:val="double" w:sz="4" w:space="0" w:color="auto"/>
+              <w:bottom w:val="double" w:sz="4" w:space="0" w:color="auto"/>
+              <w:right w:val="double" w:sz="4" w:space="0" w:color="auto"/>
+            </w:tcBorders>
           </w:tcPr>
           <w:p>
             <w:pPr>
@@ -2691,14 +2691,14 @@
         <w:tc>
           <w:tcPr>
             <w:tcW w:w="1699" w:type="dxa"/>
-            <w:tcBorders>
-              <w:top w:val="single" w:sz="4" w:space="0" w:color="000000"/>
-              <w:left w:val="single" w:sz="4" w:space="0" w:color="000000"/>
-              <w:bottom w:val="single" w:sz="4" w:space="0" w:color="000000"/>
-              <w:right w:val="single" w:sz="4" w:space="0" w:color="000000"/>
-            </w:tcBorders>
             <w:shd w:color="auto" w:fill="auto" w:val="clear"/>
             <w:vAlign w:val="center"/>
+            <w:tcBorders>
+              <w:top w:val="double" w:sz="4" w:space="0" w:color="auto"/>
+              <w:left w:val="double" w:sz="4" w:space="0" w:color="auto"/>
+              <w:bottom w:val="double" w:sz="4" w:space="0" w:color="auto"/>
+              <w:right w:val="double" w:sz="4" w:space="0" w:color="auto"/>
+            </w:tcBorders>
           </w:tcPr>
           <w:p>
             <w:pPr>
@@ -2738,14 +2738,14 @@
         <w:tc>
           <w:tcPr>
             <w:tcW w:w="4652" w:type="dxa"/>
-            <w:tcBorders>
-              <w:top w:val="single" w:sz="4" w:space="0" w:color="000000"/>
-              <w:left w:val="single" w:sz="4" w:space="0" w:color="000000"/>
-              <w:bottom w:val="single" w:sz="4" w:space="0" w:color="000000"/>
-              <w:right w:val="single" w:sz="4" w:space="0" w:color="000000"/>
-            </w:tcBorders>
             <w:shd w:color="auto" w:fill="auto" w:val="clear"/>
             <w:vAlign w:val="center"/>
+            <w:tcBorders>
+              <w:top w:val="double" w:sz="4" w:space="0" w:color="auto"/>
+              <w:left w:val="double" w:sz="4" w:space="0" w:color="auto"/>
+              <w:bottom w:val="double" w:sz="4" w:space="0" w:color="auto"/>
+              <w:right w:val="double" w:sz="4" w:space="0" w:color="auto"/>
+            </w:tcBorders>
           </w:tcPr>
           <w:p>
             <w:pPr>

</xml_diff>

<commit_message>
fix padding in second table of calculation_claim
</commit_message>
<xml_diff>
--- a/data/templates/calculation_claim.docx
+++ b/data/templates/calculation_claim.docx
@@ -132,8 +132,8 @@
         <w:gridCol w:w="194"/>
         <w:gridCol w:w="1578"/>
         <w:gridCol w:w="2050"/>
-        <w:gridCol w:w="1415"/>
-        <w:gridCol w:w="1784"/>
+        <w:gridCol w:w="1418"/>
+        <w:gridCol w:w="1781"/>
       </w:tblGrid>
       <w:tr>
         <w:trPr>
@@ -522,7 +522,7 @@
         </w:tc>
         <w:tc>
           <w:tcPr>
-            <w:tcW w:w="3465" w:type="dxa"/>
+            <w:tcW w:w="3468" w:type="dxa"/>
             <w:gridSpan w:val="2"/>
             <w:vMerge w:val="restart"/>
             <w:tcBorders>
@@ -557,7 +557,7 @@
         </w:tc>
         <w:tc>
           <w:tcPr>
-            <w:tcW w:w="1784" w:type="dxa"/>
+            <w:tcW w:w="1781" w:type="dxa"/>
             <w:vMerge w:val="restart"/>
             <w:tcBorders>
               <w:top w:val="single" w:sz="6" w:space="0" w:color="CCCCCC"/>
@@ -813,7 +813,7 @@
         </w:tc>
         <w:tc>
           <w:tcPr>
-            <w:tcW w:w="3465" w:type="dxa"/>
+            <w:tcW w:w="3468" w:type="dxa"/>
             <w:gridSpan w:val="2"/>
             <w:vMerge w:val="continue"/>
             <w:tcBorders>
@@ -843,7 +843,7 @@
         </w:tc>
         <w:tc>
           <w:tcPr>
-            <w:tcW w:w="1784" w:type="dxa"/>
+            <w:tcW w:w="1781" w:type="dxa"/>
             <w:vMerge w:val="continue"/>
             <w:tcBorders>
               <w:top w:val="single" w:sz="6" w:space="0" w:color="CCCCCC"/>
@@ -1309,7 +1309,7 @@
         </w:tc>
         <w:tc>
           <w:tcPr>
-            <w:tcW w:w="3465" w:type="dxa"/>
+            <w:tcW w:w="3468" w:type="dxa"/>
             <w:gridSpan w:val="2"/>
             <w:tcBorders>
               <w:top w:val="single" w:sz="6" w:space="0" w:color="CCCCCC"/>
@@ -1339,7 +1339,7 @@
         </w:tc>
         <w:tc>
           <w:tcPr>
-            <w:tcW w:w="1784" w:type="dxa"/>
+            <w:tcW w:w="1781" w:type="dxa"/>
             <w:tcBorders>
               <w:top w:val="single" w:sz="6" w:space="0" w:color="CCCCCC"/>
               <w:left w:val="single" w:sz="6" w:space="0" w:color="CCCCCC"/>
@@ -1758,7 +1758,7 @@
         </w:tc>
         <w:tc>
           <w:tcPr>
-            <w:tcW w:w="3465" w:type="dxa"/>
+            <w:tcW w:w="3468" w:type="dxa"/>
             <w:gridSpan w:val="2"/>
             <w:tcBorders>
               <w:top w:val="single" w:sz="6" w:space="0" w:color="CCCCCC"/>
@@ -1792,7 +1792,7 @@
         </w:tc>
         <w:tc>
           <w:tcPr>
-            <w:tcW w:w="1784" w:type="dxa"/>
+            <w:tcW w:w="1781" w:type="dxa"/>
             <w:tcBorders>
               <w:top w:val="single" w:sz="6" w:space="0" w:color="CCCCCC"/>
               <w:left w:val="single" w:sz="6" w:space="0" w:color="CCCCCC"/>
@@ -2185,14 +2185,14 @@
         <w:tc>
           <w:tcPr>
             <w:tcW w:w="3544" w:type="dxa"/>
+            <w:tcBorders>
+              <w:top w:val="double" w:sz="4" w:space="0" w:color="000000"/>
+              <w:left w:val="double" w:sz="4" w:space="0" w:color="000000"/>
+              <w:bottom w:val="double" w:sz="4" w:space="0" w:color="000000"/>
+              <w:right w:val="double" w:sz="4" w:space="0" w:color="000000"/>
+            </w:tcBorders>
             <w:shd w:color="auto" w:fill="auto" w:val="clear"/>
             <w:vAlign w:val="center"/>
-            <w:tcBorders>
-              <w:top w:val="double" w:sz="4" w:space="0" w:color="auto"/>
-              <w:left w:val="double" w:sz="4" w:space="0" w:color="auto"/>
-              <w:bottom w:val="double" w:sz="4" w:space="0" w:color="auto"/>
-              <w:right w:val="double" w:sz="4" w:space="0" w:color="auto"/>
-            </w:tcBorders>
           </w:tcPr>
           <w:p>
             <w:pPr>
@@ -2218,14 +2218,14 @@
         <w:tc>
           <w:tcPr>
             <w:tcW w:w="1843" w:type="dxa"/>
+            <w:tcBorders>
+              <w:top w:val="double" w:sz="4" w:space="0" w:color="000000"/>
+              <w:left w:val="double" w:sz="4" w:space="0" w:color="000000"/>
+              <w:bottom w:val="double" w:sz="4" w:space="0" w:color="000000"/>
+              <w:right w:val="double" w:sz="4" w:space="0" w:color="000000"/>
+            </w:tcBorders>
             <w:shd w:color="auto" w:fill="auto" w:val="clear"/>
             <w:vAlign w:val="center"/>
-            <w:tcBorders>
-              <w:top w:val="double" w:sz="4" w:space="0" w:color="auto"/>
-              <w:left w:val="double" w:sz="4" w:space="0" w:color="auto"/>
-              <w:bottom w:val="double" w:sz="4" w:space="0" w:color="auto"/>
-              <w:right w:val="double" w:sz="4" w:space="0" w:color="auto"/>
-            </w:tcBorders>
           </w:tcPr>
           <w:p>
             <w:pPr>
@@ -2251,14 +2251,14 @@
         <w:tc>
           <w:tcPr>
             <w:tcW w:w="2835" w:type="dxa"/>
+            <w:tcBorders>
+              <w:top w:val="double" w:sz="4" w:space="0" w:color="000000"/>
+              <w:left w:val="double" w:sz="4" w:space="0" w:color="000000"/>
+              <w:bottom w:val="double" w:sz="4" w:space="0" w:color="000000"/>
+              <w:right w:val="double" w:sz="4" w:space="0" w:color="000000"/>
+            </w:tcBorders>
             <w:shd w:color="auto" w:fill="auto" w:val="clear"/>
             <w:vAlign w:val="center"/>
-            <w:tcBorders>
-              <w:top w:val="double" w:sz="4" w:space="0" w:color="auto"/>
-              <w:left w:val="double" w:sz="4" w:space="0" w:color="auto"/>
-              <w:bottom w:val="double" w:sz="4" w:space="0" w:color="auto"/>
-              <w:right w:val="double" w:sz="4" w:space="0" w:color="auto"/>
-            </w:tcBorders>
           </w:tcPr>
           <w:p>
             <w:pPr>
@@ -2284,14 +2284,14 @@
         <w:tc>
           <w:tcPr>
             <w:tcW w:w="1699" w:type="dxa"/>
+            <w:tcBorders>
+              <w:top w:val="double" w:sz="4" w:space="0" w:color="000000"/>
+              <w:left w:val="double" w:sz="4" w:space="0" w:color="000000"/>
+              <w:bottom w:val="double" w:sz="4" w:space="0" w:color="000000"/>
+              <w:right w:val="double" w:sz="4" w:space="0" w:color="000000"/>
+            </w:tcBorders>
             <w:shd w:color="auto" w:fill="auto" w:val="clear"/>
             <w:vAlign w:val="center"/>
-            <w:tcBorders>
-              <w:top w:val="double" w:sz="4" w:space="0" w:color="auto"/>
-              <w:left w:val="double" w:sz="4" w:space="0" w:color="auto"/>
-              <w:bottom w:val="double" w:sz="4" w:space="0" w:color="auto"/>
-              <w:right w:val="double" w:sz="4" w:space="0" w:color="auto"/>
-            </w:tcBorders>
           </w:tcPr>
           <w:p>
             <w:pPr>
@@ -2346,14 +2346,14 @@
         <w:tc>
           <w:tcPr>
             <w:tcW w:w="4652" w:type="dxa"/>
+            <w:tcBorders>
+              <w:top w:val="double" w:sz="4" w:space="0" w:color="000000"/>
+              <w:left w:val="double" w:sz="4" w:space="0" w:color="000000"/>
+              <w:bottom w:val="double" w:sz="4" w:space="0" w:color="000000"/>
+              <w:right w:val="double" w:sz="4" w:space="0" w:color="000000"/>
+            </w:tcBorders>
             <w:shd w:color="auto" w:fill="auto" w:val="clear"/>
             <w:vAlign w:val="center"/>
-            <w:tcBorders>
-              <w:top w:val="double" w:sz="4" w:space="0" w:color="auto"/>
-              <w:left w:val="double" w:sz="4" w:space="0" w:color="auto"/>
-              <w:bottom w:val="double" w:sz="4" w:space="0" w:color="auto"/>
-              <w:right w:val="double" w:sz="4" w:space="0" w:color="auto"/>
-            </w:tcBorders>
           </w:tcPr>
           <w:p>
             <w:pPr>
@@ -2386,14 +2386,14 @@
         <w:tc>
           <w:tcPr>
             <w:tcW w:w="3544" w:type="dxa"/>
+            <w:tcBorders>
+              <w:top w:val="double" w:sz="4" w:space="0" w:color="000000"/>
+              <w:left w:val="double" w:sz="4" w:space="0" w:color="000000"/>
+              <w:bottom w:val="double" w:sz="4" w:space="0" w:color="000000"/>
+              <w:right w:val="double" w:sz="4" w:space="0" w:color="000000"/>
+            </w:tcBorders>
             <w:shd w:color="auto" w:fill="auto" w:val="clear"/>
             <w:vAlign w:val="center"/>
-            <w:tcBorders>
-              <w:top w:val="double" w:sz="4" w:space="0" w:color="auto"/>
-              <w:left w:val="double" w:sz="4" w:space="0" w:color="auto"/>
-              <w:bottom w:val="double" w:sz="4" w:space="0" w:color="auto"/>
-              <w:right w:val="double" w:sz="4" w:space="0" w:color="auto"/>
-            </w:tcBorders>
           </w:tcPr>
           <w:p>
             <w:pPr>
@@ -2422,14 +2422,14 @@
         <w:tc>
           <w:tcPr>
             <w:tcW w:w="1843" w:type="dxa"/>
+            <w:tcBorders>
+              <w:top w:val="double" w:sz="4" w:space="0" w:color="000000"/>
+              <w:left w:val="double" w:sz="4" w:space="0" w:color="000000"/>
+              <w:bottom w:val="double" w:sz="4" w:space="0" w:color="000000"/>
+              <w:right w:val="double" w:sz="4" w:space="0" w:color="000000"/>
+            </w:tcBorders>
             <w:shd w:color="auto" w:fill="auto" w:val="clear"/>
             <w:vAlign w:val="center"/>
-            <w:tcBorders>
-              <w:top w:val="double" w:sz="4" w:space="0" w:color="auto"/>
-              <w:left w:val="double" w:sz="4" w:space="0" w:color="auto"/>
-              <w:bottom w:val="double" w:sz="4" w:space="0" w:color="auto"/>
-              <w:right w:val="double" w:sz="4" w:space="0" w:color="auto"/>
-            </w:tcBorders>
           </w:tcPr>
           <w:p>
             <w:pPr>
@@ -2458,14 +2458,14 @@
         <w:tc>
           <w:tcPr>
             <w:tcW w:w="2835" w:type="dxa"/>
+            <w:tcBorders>
+              <w:top w:val="double" w:sz="4" w:space="0" w:color="000000"/>
+              <w:left w:val="double" w:sz="4" w:space="0" w:color="000000"/>
+              <w:bottom w:val="double" w:sz="4" w:space="0" w:color="000000"/>
+              <w:right w:val="double" w:sz="4" w:space="0" w:color="000000"/>
+            </w:tcBorders>
             <w:shd w:color="auto" w:fill="auto" w:val="clear"/>
             <w:vAlign w:val="center"/>
-            <w:tcBorders>
-              <w:top w:val="double" w:sz="4" w:space="0" w:color="auto"/>
-              <w:left w:val="double" w:sz="4" w:space="0" w:color="auto"/>
-              <w:bottom w:val="double" w:sz="4" w:space="0" w:color="auto"/>
-              <w:right w:val="double" w:sz="4" w:space="0" w:color="auto"/>
-            </w:tcBorders>
           </w:tcPr>
           <w:p>
             <w:pPr>
@@ -2506,14 +2506,14 @@
         <w:tc>
           <w:tcPr>
             <w:tcW w:w="1699" w:type="dxa"/>
+            <w:tcBorders>
+              <w:top w:val="double" w:sz="4" w:space="0" w:color="000000"/>
+              <w:left w:val="double" w:sz="4" w:space="0" w:color="000000"/>
+              <w:bottom w:val="double" w:sz="4" w:space="0" w:color="000000"/>
+              <w:right w:val="double" w:sz="4" w:space="0" w:color="000000"/>
+            </w:tcBorders>
             <w:shd w:color="auto" w:fill="auto" w:val="clear"/>
             <w:vAlign w:val="center"/>
-            <w:tcBorders>
-              <w:top w:val="double" w:sz="4" w:space="0" w:color="auto"/>
-              <w:left w:val="double" w:sz="4" w:space="0" w:color="auto"/>
-              <w:bottom w:val="double" w:sz="4" w:space="0" w:color="auto"/>
-              <w:right w:val="double" w:sz="4" w:space="0" w:color="auto"/>
-            </w:tcBorders>
           </w:tcPr>
           <w:p>
             <w:pPr>
@@ -2554,14 +2554,14 @@
         <w:tc>
           <w:tcPr>
             <w:tcW w:w="4652" w:type="dxa"/>
+            <w:tcBorders>
+              <w:top w:val="double" w:sz="4" w:space="0" w:color="000000"/>
+              <w:left w:val="double" w:sz="4" w:space="0" w:color="000000"/>
+              <w:bottom w:val="double" w:sz="4" w:space="0" w:color="000000"/>
+              <w:right w:val="double" w:sz="4" w:space="0" w:color="000000"/>
+            </w:tcBorders>
             <w:shd w:color="auto" w:fill="auto" w:val="clear"/>
             <w:vAlign w:val="center"/>
-            <w:tcBorders>
-              <w:top w:val="double" w:sz="4" w:space="0" w:color="auto"/>
-              <w:left w:val="double" w:sz="4" w:space="0" w:color="auto"/>
-              <w:bottom w:val="double" w:sz="4" w:space="0" w:color="auto"/>
-              <w:right w:val="double" w:sz="4" w:space="0" w:color="auto"/>
-            </w:tcBorders>
           </w:tcPr>
           <w:p>
             <w:pPr>
@@ -2608,14 +2608,14 @@
           <w:tcPr>
             <w:tcW w:w="5387" w:type="dxa"/>
             <w:gridSpan w:val="2"/>
+            <w:tcBorders>
+              <w:top w:val="double" w:sz="4" w:space="0" w:color="000000"/>
+              <w:left w:val="double" w:sz="4" w:space="0" w:color="000000"/>
+              <w:bottom w:val="double" w:sz="4" w:space="0" w:color="000000"/>
+              <w:right w:val="double" w:sz="4" w:space="0" w:color="000000"/>
+            </w:tcBorders>
             <w:shd w:color="auto" w:fill="auto" w:val="clear"/>
             <w:vAlign w:val="center"/>
-            <w:tcBorders>
-              <w:top w:val="double" w:sz="4" w:space="0" w:color="auto"/>
-              <w:left w:val="double" w:sz="4" w:space="0" w:color="auto"/>
-              <w:bottom w:val="double" w:sz="4" w:space="0" w:color="auto"/>
-              <w:right w:val="double" w:sz="4" w:space="0" w:color="auto"/>
-            </w:tcBorders>
           </w:tcPr>
           <w:p>
             <w:pPr>
@@ -2644,23 +2644,21 @@
         <w:tc>
           <w:tcPr>
             <w:tcW w:w="2835" w:type="dxa"/>
+            <w:tcBorders>
+              <w:top w:val="double" w:sz="4" w:space="0" w:color="000000"/>
+              <w:left w:val="double" w:sz="4" w:space="0" w:color="000000"/>
+              <w:bottom w:val="double" w:sz="4" w:space="0" w:color="000000"/>
+              <w:right w:val="double" w:sz="4" w:space="0" w:color="000000"/>
+            </w:tcBorders>
             <w:shd w:color="auto" w:fill="auto" w:val="clear"/>
             <w:vAlign w:val="center"/>
-            <w:tcBorders>
-              <w:top w:val="double" w:sz="4" w:space="0" w:color="auto"/>
-              <w:left w:val="double" w:sz="4" w:space="0" w:color="auto"/>
-              <w:bottom w:val="double" w:sz="4" w:space="0" w:color="auto"/>
-              <w:right w:val="double" w:sz="4" w:space="0" w:color="auto"/>
-            </w:tcBorders>
-          </w:tcPr>
-          <w:p>
-            <w:pPr>
-              <w:pStyle w:val="Normal"/>
-              <w:spacing w:lineRule="auto" w:line="240" w:before="0" w:after="0"/>
-              <w:rPr>
-                <w:sz w:val="22"/>
-                <w:szCs w:val="22"/>
-              </w:rPr>
+          </w:tcPr>
+          <w:p>
+            <w:pPr>
+              <w:pStyle w:val="Normal"/>
+              <w:spacing w:lineRule="auto" w:line="240" w:before="0" w:after="0"/>
+              <w:jc w:val="center"/>
+              <w:rPr/>
             </w:pPr>
             <w:r>
               <w:rPr>
@@ -2691,23 +2689,21 @@
         <w:tc>
           <w:tcPr>
             <w:tcW w:w="1699" w:type="dxa"/>
+            <w:tcBorders>
+              <w:top w:val="double" w:sz="4" w:space="0" w:color="000000"/>
+              <w:left w:val="double" w:sz="4" w:space="0" w:color="000000"/>
+              <w:bottom w:val="double" w:sz="4" w:space="0" w:color="000000"/>
+              <w:right w:val="double" w:sz="4" w:space="0" w:color="000000"/>
+            </w:tcBorders>
             <w:shd w:color="auto" w:fill="auto" w:val="clear"/>
             <w:vAlign w:val="center"/>
-            <w:tcBorders>
-              <w:top w:val="double" w:sz="4" w:space="0" w:color="auto"/>
-              <w:left w:val="double" w:sz="4" w:space="0" w:color="auto"/>
-              <w:bottom w:val="double" w:sz="4" w:space="0" w:color="auto"/>
-              <w:right w:val="double" w:sz="4" w:space="0" w:color="auto"/>
-            </w:tcBorders>
-          </w:tcPr>
-          <w:p>
-            <w:pPr>
-              <w:pStyle w:val="Normal"/>
-              <w:spacing w:lineRule="auto" w:line="240" w:before="0" w:after="0"/>
-              <w:rPr>
-                <w:sz w:val="22"/>
-                <w:szCs w:val="22"/>
-              </w:rPr>
+          </w:tcPr>
+          <w:p>
+            <w:pPr>
+              <w:pStyle w:val="Normal"/>
+              <w:spacing w:lineRule="auto" w:line="240" w:before="0" w:after="0"/>
+              <w:jc w:val="center"/>
+              <w:rPr/>
             </w:pPr>
             <w:r>
               <w:rPr>
@@ -2738,23 +2734,21 @@
         <w:tc>
           <w:tcPr>
             <w:tcW w:w="4652" w:type="dxa"/>
+            <w:tcBorders>
+              <w:top w:val="double" w:sz="4" w:space="0" w:color="000000"/>
+              <w:left w:val="double" w:sz="4" w:space="0" w:color="000000"/>
+              <w:bottom w:val="double" w:sz="4" w:space="0" w:color="000000"/>
+              <w:right w:val="double" w:sz="4" w:space="0" w:color="000000"/>
+            </w:tcBorders>
             <w:shd w:color="auto" w:fill="auto" w:val="clear"/>
             <w:vAlign w:val="center"/>
-            <w:tcBorders>
-              <w:top w:val="double" w:sz="4" w:space="0" w:color="auto"/>
-              <w:left w:val="double" w:sz="4" w:space="0" w:color="auto"/>
-              <w:bottom w:val="double" w:sz="4" w:space="0" w:color="auto"/>
-              <w:right w:val="double" w:sz="4" w:space="0" w:color="auto"/>
-            </w:tcBorders>
-          </w:tcPr>
-          <w:p>
-            <w:pPr>
-              <w:pStyle w:val="Normal"/>
-              <w:spacing w:lineRule="auto" w:line="240" w:before="0" w:after="0"/>
-              <w:rPr>
-                <w:sz w:val="22"/>
-                <w:szCs w:val="22"/>
-              </w:rPr>
+          </w:tcPr>
+          <w:p>
+            <w:pPr>
+              <w:pStyle w:val="Normal"/>
+              <w:spacing w:lineRule="auto" w:line="240" w:before="0" w:after="0"/>
+              <w:jc w:val="center"/>
+              <w:rPr/>
             </w:pPr>
             <w:r>
               <w:rPr>

</xml_diff>